<commit_message>
feat: add default institutional report structure, stop-slop narrative, and dual .agents support
</commit_message>
<xml_diff>
--- a/examples/sample-report/report.docx
+++ b/examples/sample-report/report.docx
@@ -7,7 +7,7 @@
         <w:pStyle w:val="Title"/>
       </w:pPr>
       <w:r>
-        <w:t xml:space="preserve">İş Tatmini ve Tükenmişlik Analizi</w:t>
+        <w:t xml:space="preserve">İş Tatmini ve Özyeterlik Araştırması</w:t>
       </w:r>
     </w:p>
     <w:p>
@@ -15,7 +15,15 @@
         <w:pStyle w:val="Subtitle"/>
       </w:pPr>
       <w:r>
-        <w:t xml:space="preserve">İstatistiksel Analiz Raporu</w:t>
+        <w:t xml:space="preserve">Staj Projesi / Veri Analiz Raporu</w:t>
+      </w:r>
+    </w:p>
+    <w:p>
+      <w:pPr>
+        <w:pStyle w:val="Author"/>
+      </w:pPr>
+      <w:r>
+        <w:t xml:space="preserve">Sılacan Soyer</w:t>
       </w:r>
     </w:p>
     <w:p>
@@ -52,13 +60,13 @@
         </w:p>
       </w:sdtContent>
     </w:sdt>
-    <w:bookmarkStart w:id="21" w:name="X4ae346c3dc7002860ba141f0a49c2c2659a807d"/>
+    <w:bookmarkStart w:id="9" w:name="giriş"/>
     <w:p>
       <w:pPr>
         <w:pStyle w:val="Heading1"/>
       </w:pPr>
       <w:r>
-        <w:t xml:space="preserve">Betimsel İstatistikler — Sürekli Değişkenler</w:t>
+        <w:t xml:space="preserve">1. Giriş</w:t>
       </w:r>
     </w:p>
     <w:p>
@@ -66,7 +74,153 @@
         <w:pStyle w:val="FirstParagraph"/>
       </w:pPr>
       <w:r>
-        <w:t xml:space="preserve">Yaş değişkeni için ortalama 41,76 (SS = 13,79, n = 300) olarak hesaplanmıştır. İş Tatmini değişkeni için ortalama 2,69 (SS = 0,91, n = 300) olarak hesaplanmıştır. Tükenmişlik değişkeni için ortalama 2,78 (SS = 0,91, n = 285) olarak hesaplanmıştır. Özyeterlik değişkeni için ortalama 3,96 (SS = 0,66, n = 300) olarak hesaplanmıştır.</w:t>
+        <w:t xml:space="preserve">Bu rapor,</w:t>
+      </w:r>
+      <w:r>
+        <w:t xml:space="preserve"> </w:t>
+      </w:r>
+      <w:r>
+        <w:rPr>
+          <w:b/>
+          <w:bCs/>
+        </w:rPr>
+        <w:t xml:space="preserve">İş Tatmini ve Özyeterlik Araştırması</w:t>
+      </w:r>
+      <w:r>
+        <w:t xml:space="preserve"> </w:t>
+      </w:r>
+      <w:r>
+        <w:t xml:space="preserve">çalışması kapsamında toplanan 300 satırlık veri tabanını analiz eder.</w:t>
+      </w:r>
+      <w:r>
+        <w:t xml:space="preserve"> </w:t>
+      </w:r>
+      <w:r>
+        <w:t xml:space="preserve">Veri seti toplam 7 değişken içermektedir (5 sürekli, 2 kategorik).</w:t>
+      </w:r>
+      <w:r>
+        <w:t xml:space="preserve"> </w:t>
+      </w:r>
+      <w:r>
+        <w:t xml:space="preserve">Analiz sürecinde dağılım parametreleri hesaplanmış, değişkenler arası ilişkiler incelenmiş ve grup bazlı farklılıklar istatistiksel testlerle değerlendirilmiştir.</w:t>
+      </w:r>
+      <w:r>
+        <w:t xml:space="preserve"> </w:t>
+      </w:r>
+      <w:r>
+        <w:t xml:space="preserve">Tüm analizlerde parametrik varsayımlar (normallik ve varyans homojenliği) kontrol edilmiş; varsayımların karşılanmadığı durumlarda sağlam parametrik olmayan yöntemler kullanılmıştır.</w:t>
+      </w:r>
+    </w:p>
+    <w:p>
+      <w:r>
+        <w:br w:type="page"/>
+      </w:r>
+    </w:p>
+    <w:bookmarkEnd w:id="9"/>
+    <w:bookmarkStart w:id="10" w:name="çalışmanın-amacı"/>
+    <w:p>
+      <w:pPr>
+        <w:pStyle w:val="Heading1"/>
+      </w:pPr>
+      <w:r>
+        <w:t xml:space="preserve">2. Çalışmanın Amacı</w:t>
+      </w:r>
+    </w:p>
+    <w:p>
+      <w:pPr>
+        <w:pStyle w:val="FirstParagraph"/>
+      </w:pPr>
+      <w:r>
+        <w:t xml:space="preserve">Bu çalışmanın temel hedefleri şunlardır:</w:t>
+      </w:r>
+    </w:p>
+    <w:p>
+      <w:pPr>
+        <w:pStyle w:val="Compact"/>
+        <w:numPr>
+          <w:ilvl w:val="0"/>
+          <w:numId w:val="1001"/>
+        </w:numPr>
+      </w:pPr>
+      <w:r>
+        <w:t xml:space="preserve">Veri setindeki 5 sürekli değişkenin merkezi eğilim, basıklık, çarpıklık ve saçılım özelliklerini belirlemek.</w:t>
+      </w:r>
+    </w:p>
+    <w:p>
+      <w:pPr>
+        <w:pStyle w:val="Compact"/>
+        <w:numPr>
+          <w:ilvl w:val="0"/>
+          <w:numId w:val="1001"/>
+        </w:numPr>
+      </w:pPr>
+      <w:r>
+        <w:t xml:space="preserve">Değişkenler arasındaki ikili doğrusal ve monotonik ilişkileri saptamak.</w:t>
+      </w:r>
+    </w:p>
+    <w:p>
+      <w:pPr>
+        <w:pStyle w:val="Compact"/>
+        <w:numPr>
+          <w:ilvl w:val="0"/>
+          <w:numId w:val="1001"/>
+        </w:numPr>
+      </w:pPr>
+      <w:r>
+        <w:t xml:space="preserve">Cinsiyet grupları arasında Yaş düzeylerinin anlamlı farklılık gösterip göstermediğini test etmek.</w:t>
+      </w:r>
+    </w:p>
+    <w:p>
+      <w:pPr>
+        <w:pStyle w:val="Compact"/>
+        <w:numPr>
+          <w:ilvl w:val="0"/>
+          <w:numId w:val="1001"/>
+        </w:numPr>
+      </w:pPr>
+      <w:r>
+        <w:t xml:space="preserve">Yaş, İş Tatmini, Tükenmişlik değişkenlerinin Yaş üzerindeki yordayıcı etkisini modellemek.</w:t>
+      </w:r>
+    </w:p>
+    <w:p>
+      <w:pPr>
+        <w:pStyle w:val="Compact"/>
+        <w:numPr>
+          <w:ilvl w:val="0"/>
+          <w:numId w:val="1001"/>
+        </w:numPr>
+      </w:pPr>
+      <w:r>
+        <w:t xml:space="preserve">Elde edilen istatistiksel bulgular doğrultusunda operasyonel ve stratejik karar desteği sağlamak.</w:t>
+      </w:r>
+    </w:p>
+    <w:p>
+      <w:r>
+        <w:br w:type="page"/>
+      </w:r>
+    </w:p>
+    <w:bookmarkEnd w:id="10"/>
+    <w:bookmarkStart w:id="11" w:name="veri-setinin-tanıtımı"/>
+    <w:p>
+      <w:pPr>
+        <w:pStyle w:val="Heading1"/>
+      </w:pPr>
+      <w:r>
+        <w:t xml:space="preserve">3. Veri Setinin Tanıtımı</w:t>
+      </w:r>
+    </w:p>
+    <w:p>
+      <w:pPr>
+        <w:pStyle w:val="FirstParagraph"/>
+      </w:pPr>
+      <w:r>
+        <w:t xml:space="preserve">Çalışmada kullanılan veri seti toplam 300 gözlem kaydından ve 7 değişkenden oluşmaktadır.</w:t>
+      </w:r>
+      <w:r>
+        <w:t xml:space="preserve"> </w:t>
+      </w:r>
+      <w:r>
+        <w:t xml:space="preserve">Veri setindeki değişkenler ve veri türleri Tablo 1’de listelenmiştir.</w:t>
       </w:r>
     </w:p>
     <w:p>
@@ -74,7 +228,7 @@
         <w:pStyle w:val="TableCaption"/>
       </w:pPr>
       <w:r>
-        <w:t xml:space="preserve">Tablo 1. Sürekli Değişkenler İçin Betimsel İstatistikler</w:t>
+        <w:t xml:space="preserve">Tablo 1. Veri Setinde Yer Alan Değişkenler ve Özellikleri</w:t>
       </w:r>
     </w:p>
     <w:tbl>
@@ -82,7 +236,924 @@
         <w:tblStyle w:val="Table"/>
         <w:tblW w:type="auto" w:w="0"/>
         <w:tblLook w:firstRow="1" w:lastRow="0" w:firstColumn="0" w:lastColumn="0" w:noHBand="0" w:noVBand="0" w:val="0020"/>
-        <w:tblCaption w:val="Tablo 1. Sürekli Değişkenler İçin Betimsel İstatistikler"/>
+        <w:tblCaption w:val="Tablo 1. Veri Setinde Yer Alan Değişkenler ve Özellikleri"/>
+      </w:tblPr>
+      <w:tblGrid>
+        <w:gridCol w:w="1584"/>
+        <w:gridCol w:w="1584"/>
+        <w:gridCol w:w="1584"/>
+        <w:gridCol w:w="1584"/>
+        <w:gridCol w:w="1584"/>
+      </w:tblGrid>
+      <w:tr>
+        <w:trPr>
+          <w:tblHeader w:val="on"/>
+        </w:trPr>
+        <w:tc>
+          <w:tcPr>
+            <w:tcBorders>
+              <w:top w:sz="6" w:val="single" w:color="000000"/>
+              <w:left w:sz="0" w:val="nil" w:color="auto"/>
+              <w:bottom w:sz="6" w:val="single" w:color="000000"/>
+              <w:right w:sz="0" w:val="nil" w:color="auto"/>
+            </w:tcBorders>
+          </w:tcPr>
+          <w:p>
+            <w:pPr>
+              <w:pStyle w:val="Compact"/>
+            </w:pPr>
+            <w:r>
+              <w:t xml:space="preserve">Değişken</w:t>
+            </w:r>
+          </w:p>
+        </w:tc>
+        <w:tc>
+          <w:tcPr>
+            <w:tcBorders>
+              <w:top w:sz="6" w:val="single" w:color="000000"/>
+              <w:left w:sz="0" w:val="nil" w:color="auto"/>
+              <w:bottom w:sz="6" w:val="single" w:color="000000"/>
+              <w:right w:sz="0" w:val="nil" w:color="auto"/>
+            </w:tcBorders>
+          </w:tcPr>
+          <w:p>
+            <w:pPr>
+              <w:pStyle w:val="Compact"/>
+            </w:pPr>
+            <w:r>
+              <w:t xml:space="preserve">Veri Türü</w:t>
+            </w:r>
+          </w:p>
+        </w:tc>
+        <w:tc>
+          <w:tcPr>
+            <w:tcBorders>
+              <w:top w:sz="6" w:val="single" w:color="000000"/>
+              <w:left w:sz="0" w:val="nil" w:color="auto"/>
+              <w:bottom w:sz="6" w:val="single" w:color="000000"/>
+              <w:right w:sz="0" w:val="nil" w:color="auto"/>
+            </w:tcBorders>
+          </w:tcPr>
+          <w:p>
+            <w:pPr>
+              <w:pStyle w:val="Compact"/>
+              <w:jc w:val="right"/>
+            </w:pPr>
+            <w:r>
+              <w:t xml:space="preserve">Geçerli N</w:t>
+            </w:r>
+          </w:p>
+        </w:tc>
+        <w:tc>
+          <w:tcPr>
+            <w:tcBorders>
+              <w:top w:sz="6" w:val="single" w:color="000000"/>
+              <w:left w:sz="0" w:val="nil" w:color="auto"/>
+              <w:bottom w:sz="6" w:val="single" w:color="000000"/>
+              <w:right w:sz="0" w:val="nil" w:color="auto"/>
+            </w:tcBorders>
+          </w:tcPr>
+          <w:p>
+            <w:pPr>
+              <w:pStyle w:val="Compact"/>
+              <w:jc w:val="right"/>
+            </w:pPr>
+            <w:r>
+              <w:t xml:space="preserve">Kayıp Oranı</w:t>
+            </w:r>
+          </w:p>
+        </w:tc>
+        <w:tc>
+          <w:tcPr>
+            <w:tcBorders>
+              <w:top w:sz="6" w:val="single" w:color="000000"/>
+              <w:left w:sz="0" w:val="nil" w:color="auto"/>
+              <w:bottom w:sz="6" w:val="single" w:color="000000"/>
+              <w:right w:sz="0" w:val="nil" w:color="auto"/>
+            </w:tcBorders>
+          </w:tcPr>
+          <w:p>
+            <w:pPr>
+              <w:pStyle w:val="Compact"/>
+              <w:jc w:val="right"/>
+            </w:pPr>
+            <w:r>
+              <w:t xml:space="preserve">Tekil Değer</w:t>
+            </w:r>
+          </w:p>
+        </w:tc>
+      </w:tr>
+      <w:tr>
+        <w:tc>
+          <w:tcPr>
+            <w:tcBorders>
+              <w:top w:sz="0" w:val="nil" w:color="auto"/>
+              <w:left w:sz="0" w:val="nil" w:color="auto"/>
+              <w:bottom w:sz="0" w:val="nil" w:color="auto"/>
+              <w:right w:sz="0" w:val="nil" w:color="auto"/>
+            </w:tcBorders>
+          </w:tcPr>
+          <w:p>
+            <w:pPr>
+              <w:pStyle w:val="Compact"/>
+            </w:pPr>
+            <w:r>
+              <w:t xml:space="preserve">Katılımcı No</w:t>
+            </w:r>
+          </w:p>
+        </w:tc>
+        <w:tc>
+          <w:tcPr>
+            <w:tcBorders>
+              <w:top w:sz="0" w:val="nil" w:color="auto"/>
+              <w:left w:sz="0" w:val="nil" w:color="auto"/>
+              <w:bottom w:sz="0" w:val="nil" w:color="auto"/>
+              <w:right w:sz="0" w:val="nil" w:color="auto"/>
+            </w:tcBorders>
+          </w:tcPr>
+          <w:p>
+            <w:pPr>
+              <w:pStyle w:val="Compact"/>
+            </w:pPr>
+            <w:r>
+              <w:t xml:space="preserve">Sürekli (Sayısal)</w:t>
+            </w:r>
+          </w:p>
+        </w:tc>
+        <w:tc>
+          <w:tcPr>
+            <w:tcBorders>
+              <w:top w:sz="0" w:val="nil" w:color="auto"/>
+              <w:left w:sz="0" w:val="nil" w:color="auto"/>
+              <w:bottom w:sz="0" w:val="nil" w:color="auto"/>
+              <w:right w:sz="0" w:val="nil" w:color="auto"/>
+            </w:tcBorders>
+          </w:tcPr>
+          <w:p>
+            <w:pPr>
+              <w:pStyle w:val="Compact"/>
+              <w:jc w:val="right"/>
+            </w:pPr>
+            <w:r>
+              <w:t xml:space="preserve">300</w:t>
+            </w:r>
+          </w:p>
+        </w:tc>
+        <w:tc>
+          <w:tcPr>
+            <w:tcBorders>
+              <w:top w:sz="0" w:val="nil" w:color="auto"/>
+              <w:left w:sz="0" w:val="nil" w:color="auto"/>
+              <w:bottom w:sz="0" w:val="nil" w:color="auto"/>
+              <w:right w:sz="0" w:val="nil" w:color="auto"/>
+            </w:tcBorders>
+          </w:tcPr>
+          <w:p>
+            <w:pPr>
+              <w:pStyle w:val="Compact"/>
+              <w:jc w:val="right"/>
+            </w:pPr>
+            <w:r>
+              <w:t xml:space="preserve">%0,0</w:t>
+            </w:r>
+          </w:p>
+        </w:tc>
+        <w:tc>
+          <w:tcPr>
+            <w:tcBorders>
+              <w:top w:sz="0" w:val="nil" w:color="auto"/>
+              <w:left w:sz="0" w:val="nil" w:color="auto"/>
+              <w:bottom w:sz="0" w:val="nil" w:color="auto"/>
+              <w:right w:sz="0" w:val="nil" w:color="auto"/>
+            </w:tcBorders>
+          </w:tcPr>
+          <w:p>
+            <w:pPr>
+              <w:pStyle w:val="Compact"/>
+              <w:jc w:val="right"/>
+            </w:pPr>
+            <w:r>
+              <w:t xml:space="preserve">300</w:t>
+            </w:r>
+          </w:p>
+        </w:tc>
+      </w:tr>
+      <w:tr>
+        <w:tc>
+          <w:tcPr>
+            <w:tcBorders>
+              <w:top w:sz="0" w:val="nil" w:color="auto"/>
+              <w:left w:sz="0" w:val="nil" w:color="auto"/>
+              <w:bottom w:sz="0" w:val="nil" w:color="auto"/>
+              <w:right w:sz="0" w:val="nil" w:color="auto"/>
+            </w:tcBorders>
+          </w:tcPr>
+          <w:p>
+            <w:pPr>
+              <w:pStyle w:val="Compact"/>
+            </w:pPr>
+            <w:r>
+              <w:t xml:space="preserve">Yaş</w:t>
+            </w:r>
+          </w:p>
+        </w:tc>
+        <w:tc>
+          <w:tcPr>
+            <w:tcBorders>
+              <w:top w:sz="0" w:val="nil" w:color="auto"/>
+              <w:left w:sz="0" w:val="nil" w:color="auto"/>
+              <w:bottom w:sz="0" w:val="nil" w:color="auto"/>
+              <w:right w:sz="0" w:val="nil" w:color="auto"/>
+            </w:tcBorders>
+          </w:tcPr>
+          <w:p>
+            <w:pPr>
+              <w:pStyle w:val="Compact"/>
+            </w:pPr>
+            <w:r>
+              <w:t xml:space="preserve">Sürekli (Sayısal)</w:t>
+            </w:r>
+          </w:p>
+        </w:tc>
+        <w:tc>
+          <w:tcPr>
+            <w:tcBorders>
+              <w:top w:sz="0" w:val="nil" w:color="auto"/>
+              <w:left w:sz="0" w:val="nil" w:color="auto"/>
+              <w:bottom w:sz="0" w:val="nil" w:color="auto"/>
+              <w:right w:sz="0" w:val="nil" w:color="auto"/>
+            </w:tcBorders>
+          </w:tcPr>
+          <w:p>
+            <w:pPr>
+              <w:pStyle w:val="Compact"/>
+              <w:jc w:val="right"/>
+            </w:pPr>
+            <w:r>
+              <w:t xml:space="preserve">300</w:t>
+            </w:r>
+          </w:p>
+        </w:tc>
+        <w:tc>
+          <w:tcPr>
+            <w:tcBorders>
+              <w:top w:sz="0" w:val="nil" w:color="auto"/>
+              <w:left w:sz="0" w:val="nil" w:color="auto"/>
+              <w:bottom w:sz="0" w:val="nil" w:color="auto"/>
+              <w:right w:sz="0" w:val="nil" w:color="auto"/>
+            </w:tcBorders>
+          </w:tcPr>
+          <w:p>
+            <w:pPr>
+              <w:pStyle w:val="Compact"/>
+              <w:jc w:val="right"/>
+            </w:pPr>
+            <w:r>
+              <w:t xml:space="preserve">%0,0</w:t>
+            </w:r>
+          </w:p>
+        </w:tc>
+        <w:tc>
+          <w:tcPr>
+            <w:tcBorders>
+              <w:top w:sz="0" w:val="nil" w:color="auto"/>
+              <w:left w:sz="0" w:val="nil" w:color="auto"/>
+              <w:bottom w:sz="0" w:val="nil" w:color="auto"/>
+              <w:right w:sz="0" w:val="nil" w:color="auto"/>
+            </w:tcBorders>
+          </w:tcPr>
+          <w:p>
+            <w:pPr>
+              <w:pStyle w:val="Compact"/>
+              <w:jc w:val="right"/>
+            </w:pPr>
+            <w:r>
+              <w:t xml:space="preserve">47</w:t>
+            </w:r>
+          </w:p>
+        </w:tc>
+      </w:tr>
+      <w:tr>
+        <w:tc>
+          <w:tcPr>
+            <w:tcBorders>
+              <w:top w:sz="0" w:val="nil" w:color="auto"/>
+              <w:left w:sz="0" w:val="nil" w:color="auto"/>
+              <w:bottom w:sz="0" w:val="nil" w:color="auto"/>
+              <w:right w:sz="0" w:val="nil" w:color="auto"/>
+            </w:tcBorders>
+          </w:tcPr>
+          <w:p>
+            <w:pPr>
+              <w:pStyle w:val="Compact"/>
+            </w:pPr>
+            <w:r>
+              <w:t xml:space="preserve">Cinsiyet</w:t>
+            </w:r>
+          </w:p>
+        </w:tc>
+        <w:tc>
+          <w:tcPr>
+            <w:tcBorders>
+              <w:top w:sz="0" w:val="nil" w:color="auto"/>
+              <w:left w:sz="0" w:val="nil" w:color="auto"/>
+              <w:bottom w:sz="0" w:val="nil" w:color="auto"/>
+              <w:right w:sz="0" w:val="nil" w:color="auto"/>
+            </w:tcBorders>
+          </w:tcPr>
+          <w:p>
+            <w:pPr>
+              <w:pStyle w:val="Compact"/>
+            </w:pPr>
+            <w:r>
+              <w:t xml:space="preserve">Kategorik</w:t>
+            </w:r>
+          </w:p>
+        </w:tc>
+        <w:tc>
+          <w:tcPr>
+            <w:tcBorders>
+              <w:top w:sz="0" w:val="nil" w:color="auto"/>
+              <w:left w:sz="0" w:val="nil" w:color="auto"/>
+              <w:bottom w:sz="0" w:val="nil" w:color="auto"/>
+              <w:right w:sz="0" w:val="nil" w:color="auto"/>
+            </w:tcBorders>
+          </w:tcPr>
+          <w:p>
+            <w:pPr>
+              <w:pStyle w:val="Compact"/>
+              <w:jc w:val="right"/>
+            </w:pPr>
+            <w:r>
+              <w:t xml:space="preserve">300</w:t>
+            </w:r>
+          </w:p>
+        </w:tc>
+        <w:tc>
+          <w:tcPr>
+            <w:tcBorders>
+              <w:top w:sz="0" w:val="nil" w:color="auto"/>
+              <w:left w:sz="0" w:val="nil" w:color="auto"/>
+              <w:bottom w:sz="0" w:val="nil" w:color="auto"/>
+              <w:right w:sz="0" w:val="nil" w:color="auto"/>
+            </w:tcBorders>
+          </w:tcPr>
+          <w:p>
+            <w:pPr>
+              <w:pStyle w:val="Compact"/>
+              <w:jc w:val="right"/>
+            </w:pPr>
+            <w:r>
+              <w:t xml:space="preserve">%0,0</w:t>
+            </w:r>
+          </w:p>
+        </w:tc>
+        <w:tc>
+          <w:tcPr>
+            <w:tcBorders>
+              <w:top w:sz="0" w:val="nil" w:color="auto"/>
+              <w:left w:sz="0" w:val="nil" w:color="auto"/>
+              <w:bottom w:sz="0" w:val="nil" w:color="auto"/>
+              <w:right w:sz="0" w:val="nil" w:color="auto"/>
+            </w:tcBorders>
+          </w:tcPr>
+          <w:p>
+            <w:pPr>
+              <w:pStyle w:val="Compact"/>
+              <w:jc w:val="right"/>
+            </w:pPr>
+            <w:r>
+              <w:t xml:space="preserve">2</w:t>
+            </w:r>
+          </w:p>
+        </w:tc>
+      </w:tr>
+      <w:tr>
+        <w:tc>
+          <w:tcPr>
+            <w:tcBorders>
+              <w:top w:sz="0" w:val="nil" w:color="auto"/>
+              <w:left w:sz="0" w:val="nil" w:color="auto"/>
+              <w:bottom w:sz="0" w:val="nil" w:color="auto"/>
+              <w:right w:sz="0" w:val="nil" w:color="auto"/>
+            </w:tcBorders>
+          </w:tcPr>
+          <w:p>
+            <w:pPr>
+              <w:pStyle w:val="Compact"/>
+            </w:pPr>
+            <w:r>
+              <w:t xml:space="preserve">Eğitim Düzeyi</w:t>
+            </w:r>
+          </w:p>
+        </w:tc>
+        <w:tc>
+          <w:tcPr>
+            <w:tcBorders>
+              <w:top w:sz="0" w:val="nil" w:color="auto"/>
+              <w:left w:sz="0" w:val="nil" w:color="auto"/>
+              <w:bottom w:sz="0" w:val="nil" w:color="auto"/>
+              <w:right w:sz="0" w:val="nil" w:color="auto"/>
+            </w:tcBorders>
+          </w:tcPr>
+          <w:p>
+            <w:pPr>
+              <w:pStyle w:val="Compact"/>
+            </w:pPr>
+            <w:r>
+              <w:t xml:space="preserve">Kategorik</w:t>
+            </w:r>
+          </w:p>
+        </w:tc>
+        <w:tc>
+          <w:tcPr>
+            <w:tcBorders>
+              <w:top w:sz="0" w:val="nil" w:color="auto"/>
+              <w:left w:sz="0" w:val="nil" w:color="auto"/>
+              <w:bottom w:sz="0" w:val="nil" w:color="auto"/>
+              <w:right w:sz="0" w:val="nil" w:color="auto"/>
+            </w:tcBorders>
+          </w:tcPr>
+          <w:p>
+            <w:pPr>
+              <w:pStyle w:val="Compact"/>
+              <w:jc w:val="right"/>
+            </w:pPr>
+            <w:r>
+              <w:t xml:space="preserve">300</w:t>
+            </w:r>
+          </w:p>
+        </w:tc>
+        <w:tc>
+          <w:tcPr>
+            <w:tcBorders>
+              <w:top w:sz="0" w:val="nil" w:color="auto"/>
+              <w:left w:sz="0" w:val="nil" w:color="auto"/>
+              <w:bottom w:sz="0" w:val="nil" w:color="auto"/>
+              <w:right w:sz="0" w:val="nil" w:color="auto"/>
+            </w:tcBorders>
+          </w:tcPr>
+          <w:p>
+            <w:pPr>
+              <w:pStyle w:val="Compact"/>
+              <w:jc w:val="right"/>
+            </w:pPr>
+            <w:r>
+              <w:t xml:space="preserve">%0,0</w:t>
+            </w:r>
+          </w:p>
+        </w:tc>
+        <w:tc>
+          <w:tcPr>
+            <w:tcBorders>
+              <w:top w:sz="0" w:val="nil" w:color="auto"/>
+              <w:left w:sz="0" w:val="nil" w:color="auto"/>
+              <w:bottom w:sz="0" w:val="nil" w:color="auto"/>
+              <w:right w:sz="0" w:val="nil" w:color="auto"/>
+            </w:tcBorders>
+          </w:tcPr>
+          <w:p>
+            <w:pPr>
+              <w:pStyle w:val="Compact"/>
+              <w:jc w:val="right"/>
+            </w:pPr>
+            <w:r>
+              <w:t xml:space="preserve">3</w:t>
+            </w:r>
+          </w:p>
+        </w:tc>
+      </w:tr>
+      <w:tr>
+        <w:tc>
+          <w:tcPr>
+            <w:tcBorders>
+              <w:top w:sz="0" w:val="nil" w:color="auto"/>
+              <w:left w:sz="0" w:val="nil" w:color="auto"/>
+              <w:bottom w:sz="0" w:val="nil" w:color="auto"/>
+              <w:right w:sz="0" w:val="nil" w:color="auto"/>
+            </w:tcBorders>
+          </w:tcPr>
+          <w:p>
+            <w:pPr>
+              <w:pStyle w:val="Compact"/>
+            </w:pPr>
+            <w:r>
+              <w:t xml:space="preserve">İş Tatmini</w:t>
+            </w:r>
+          </w:p>
+        </w:tc>
+        <w:tc>
+          <w:tcPr>
+            <w:tcBorders>
+              <w:top w:sz="0" w:val="nil" w:color="auto"/>
+              <w:left w:sz="0" w:val="nil" w:color="auto"/>
+              <w:bottom w:sz="0" w:val="nil" w:color="auto"/>
+              <w:right w:sz="0" w:val="nil" w:color="auto"/>
+            </w:tcBorders>
+          </w:tcPr>
+          <w:p>
+            <w:pPr>
+              <w:pStyle w:val="Compact"/>
+            </w:pPr>
+            <w:r>
+              <w:t xml:space="preserve">Sürekli (Sayısal)</w:t>
+            </w:r>
+          </w:p>
+        </w:tc>
+        <w:tc>
+          <w:tcPr>
+            <w:tcBorders>
+              <w:top w:sz="0" w:val="nil" w:color="auto"/>
+              <w:left w:sz="0" w:val="nil" w:color="auto"/>
+              <w:bottom w:sz="0" w:val="nil" w:color="auto"/>
+              <w:right w:sz="0" w:val="nil" w:color="auto"/>
+            </w:tcBorders>
+          </w:tcPr>
+          <w:p>
+            <w:pPr>
+              <w:pStyle w:val="Compact"/>
+              <w:jc w:val="right"/>
+            </w:pPr>
+            <w:r>
+              <w:t xml:space="preserve">300</w:t>
+            </w:r>
+          </w:p>
+        </w:tc>
+        <w:tc>
+          <w:tcPr>
+            <w:tcBorders>
+              <w:top w:sz="0" w:val="nil" w:color="auto"/>
+              <w:left w:sz="0" w:val="nil" w:color="auto"/>
+              <w:bottom w:sz="0" w:val="nil" w:color="auto"/>
+              <w:right w:sz="0" w:val="nil" w:color="auto"/>
+            </w:tcBorders>
+          </w:tcPr>
+          <w:p>
+            <w:pPr>
+              <w:pStyle w:val="Compact"/>
+              <w:jc w:val="right"/>
+            </w:pPr>
+            <w:r>
+              <w:t xml:space="preserve">%0,0</w:t>
+            </w:r>
+          </w:p>
+        </w:tc>
+        <w:tc>
+          <w:tcPr>
+            <w:tcBorders>
+              <w:top w:sz="0" w:val="nil" w:color="auto"/>
+              <w:left w:sz="0" w:val="nil" w:color="auto"/>
+              <w:bottom w:sz="0" w:val="nil" w:color="auto"/>
+              <w:right w:sz="0" w:val="nil" w:color="auto"/>
+            </w:tcBorders>
+          </w:tcPr>
+          <w:p>
+            <w:pPr>
+              <w:pStyle w:val="Compact"/>
+              <w:jc w:val="right"/>
+            </w:pPr>
+            <w:r>
+              <w:t xml:space="preserve">37</w:t>
+            </w:r>
+          </w:p>
+        </w:tc>
+      </w:tr>
+      <w:tr>
+        <w:tc>
+          <w:tcPr>
+            <w:tcBorders>
+              <w:top w:sz="0" w:val="nil" w:color="auto"/>
+              <w:left w:sz="0" w:val="nil" w:color="auto"/>
+              <w:bottom w:sz="0" w:val="nil" w:color="auto"/>
+              <w:right w:sz="0" w:val="nil" w:color="auto"/>
+            </w:tcBorders>
+          </w:tcPr>
+          <w:p>
+            <w:pPr>
+              <w:pStyle w:val="Compact"/>
+            </w:pPr>
+            <w:r>
+              <w:t xml:space="preserve">Tükenmişlik</w:t>
+            </w:r>
+          </w:p>
+        </w:tc>
+        <w:tc>
+          <w:tcPr>
+            <w:tcBorders>
+              <w:top w:sz="0" w:val="nil" w:color="auto"/>
+              <w:left w:sz="0" w:val="nil" w:color="auto"/>
+              <w:bottom w:sz="0" w:val="nil" w:color="auto"/>
+              <w:right w:sz="0" w:val="nil" w:color="auto"/>
+            </w:tcBorders>
+          </w:tcPr>
+          <w:p>
+            <w:pPr>
+              <w:pStyle w:val="Compact"/>
+            </w:pPr>
+            <w:r>
+              <w:t xml:space="preserve">Sürekli (Sayısal)</w:t>
+            </w:r>
+          </w:p>
+        </w:tc>
+        <w:tc>
+          <w:tcPr>
+            <w:tcBorders>
+              <w:top w:sz="0" w:val="nil" w:color="auto"/>
+              <w:left w:sz="0" w:val="nil" w:color="auto"/>
+              <w:bottom w:sz="0" w:val="nil" w:color="auto"/>
+              <w:right w:sz="0" w:val="nil" w:color="auto"/>
+            </w:tcBorders>
+          </w:tcPr>
+          <w:p>
+            <w:pPr>
+              <w:pStyle w:val="Compact"/>
+              <w:jc w:val="right"/>
+            </w:pPr>
+            <w:r>
+              <w:t xml:space="preserve">285</w:t>
+            </w:r>
+          </w:p>
+        </w:tc>
+        <w:tc>
+          <w:tcPr>
+            <w:tcBorders>
+              <w:top w:sz="0" w:val="nil" w:color="auto"/>
+              <w:left w:sz="0" w:val="nil" w:color="auto"/>
+              <w:bottom w:sz="0" w:val="nil" w:color="auto"/>
+              <w:right w:sz="0" w:val="nil" w:color="auto"/>
+            </w:tcBorders>
+          </w:tcPr>
+          <w:p>
+            <w:pPr>
+              <w:pStyle w:val="Compact"/>
+              <w:jc w:val="right"/>
+            </w:pPr>
+            <w:r>
+              <w:t xml:space="preserve">%5,0</w:t>
+            </w:r>
+          </w:p>
+        </w:tc>
+        <w:tc>
+          <w:tcPr>
+            <w:tcBorders>
+              <w:top w:sz="0" w:val="nil" w:color="auto"/>
+              <w:left w:sz="0" w:val="nil" w:color="auto"/>
+              <w:bottom w:sz="0" w:val="nil" w:color="auto"/>
+              <w:right w:sz="0" w:val="nil" w:color="auto"/>
+            </w:tcBorders>
+          </w:tcPr>
+          <w:p>
+            <w:pPr>
+              <w:pStyle w:val="Compact"/>
+              <w:jc w:val="right"/>
+            </w:pPr>
+            <w:r>
+              <w:t xml:space="preserve">39</w:t>
+            </w:r>
+          </w:p>
+        </w:tc>
+      </w:tr>
+      <w:tr>
+        <w:tc>
+          <w:tcPr>
+            <w:tcBorders>
+              <w:top w:sz="0" w:val="nil" w:color="auto"/>
+              <w:left w:sz="0" w:val="nil" w:color="auto"/>
+              <w:bottom w:sz="6" w:val="single" w:color="000000"/>
+              <w:right w:sz="0" w:val="nil" w:color="auto"/>
+            </w:tcBorders>
+          </w:tcPr>
+          <w:p>
+            <w:pPr>
+              <w:pStyle w:val="Compact"/>
+            </w:pPr>
+            <w:r>
+              <w:t xml:space="preserve">Özyeterlik</w:t>
+            </w:r>
+          </w:p>
+        </w:tc>
+        <w:tc>
+          <w:tcPr>
+            <w:tcBorders>
+              <w:top w:sz="0" w:val="nil" w:color="auto"/>
+              <w:left w:sz="0" w:val="nil" w:color="auto"/>
+              <w:bottom w:sz="6" w:val="single" w:color="000000"/>
+              <w:right w:sz="0" w:val="nil" w:color="auto"/>
+            </w:tcBorders>
+          </w:tcPr>
+          <w:p>
+            <w:pPr>
+              <w:pStyle w:val="Compact"/>
+            </w:pPr>
+            <w:r>
+              <w:t xml:space="preserve">Sürekli (Sayısal)</w:t>
+            </w:r>
+          </w:p>
+        </w:tc>
+        <w:tc>
+          <w:tcPr>
+            <w:tcBorders>
+              <w:top w:sz="0" w:val="nil" w:color="auto"/>
+              <w:left w:sz="0" w:val="nil" w:color="auto"/>
+              <w:bottom w:sz="6" w:val="single" w:color="000000"/>
+              <w:right w:sz="0" w:val="nil" w:color="auto"/>
+            </w:tcBorders>
+          </w:tcPr>
+          <w:p>
+            <w:pPr>
+              <w:pStyle w:val="Compact"/>
+              <w:jc w:val="right"/>
+            </w:pPr>
+            <w:r>
+              <w:t xml:space="preserve">300</w:t>
+            </w:r>
+          </w:p>
+        </w:tc>
+        <w:tc>
+          <w:tcPr>
+            <w:tcBorders>
+              <w:top w:sz="0" w:val="nil" w:color="auto"/>
+              <w:left w:sz="0" w:val="nil" w:color="auto"/>
+              <w:bottom w:sz="6" w:val="single" w:color="000000"/>
+              <w:right w:sz="0" w:val="nil" w:color="auto"/>
+            </w:tcBorders>
+          </w:tcPr>
+          <w:p>
+            <w:pPr>
+              <w:pStyle w:val="Compact"/>
+              <w:jc w:val="right"/>
+            </w:pPr>
+            <w:r>
+              <w:t xml:space="preserve">%0,0</w:t>
+            </w:r>
+          </w:p>
+        </w:tc>
+        <w:tc>
+          <w:tcPr>
+            <w:tcBorders>
+              <w:top w:sz="0" w:val="nil" w:color="auto"/>
+              <w:left w:sz="0" w:val="nil" w:color="auto"/>
+              <w:bottom w:sz="6" w:val="single" w:color="000000"/>
+              <w:right w:sz="0" w:val="nil" w:color="auto"/>
+            </w:tcBorders>
+          </w:tcPr>
+          <w:p>
+            <w:pPr>
+              <w:pStyle w:val="Compact"/>
+              <w:jc w:val="right"/>
+            </w:pPr>
+            <w:r>
+              <w:t xml:space="preserve">35</w:t>
+            </w:r>
+          </w:p>
+        </w:tc>
+      </w:tr>
+    </w:tbl>
+    <w:p>
+      <w:r>
+        <w:br w:type="page"/>
+      </w:r>
+    </w:p>
+    <w:bookmarkEnd w:id="11"/>
+    <w:bookmarkStart w:id="16" w:name="veri-hazırlama-süreci"/>
+    <w:p>
+      <w:pPr>
+        <w:pStyle w:val="Heading1"/>
+      </w:pPr>
+      <w:r>
+        <w:t xml:space="preserve">4. Veri Hazırlama Süreci</w:t>
+      </w:r>
+    </w:p>
+    <w:bookmarkStart w:id="12" w:name="verilerin-yüklenmesi-ve-birleştirilmesi"/>
+    <w:p>
+      <w:pPr>
+        <w:pStyle w:val="Heading3"/>
+      </w:pPr>
+      <w:r>
+        <w:t xml:space="preserve">4.1 Verilerin Yüklenmesi ve Birleştirilmesi</w:t>
+      </w:r>
+    </w:p>
+    <w:p>
+      <w:pPr>
+        <w:pStyle w:val="FirstParagraph"/>
+      </w:pPr>
+      <w:r>
+        <w:t xml:space="preserve">Veri kaynakları sisteme aktarılmış; Excel çalışma sayfası yapısı ve</w:t>
+      </w:r>
+      <w:r>
+        <w:t xml:space="preserve"> </w:t>
+      </w:r>
+      <w:r>
+        <w:rPr>
+          <w:rStyle w:val="VerbatimChar"/>
+        </w:rPr>
+        <w:t xml:space="preserve">.</w:t>
+      </w:r>
+      <w:r>
+        <w:t xml:space="preserve"> </w:t>
+      </w:r>
+      <w:r>
+        <w:t xml:space="preserve">ondalık gösterim standardı doğrulanmıştır.</w:t>
+      </w:r>
+    </w:p>
+    <w:bookmarkEnd w:id="12"/>
+    <w:bookmarkStart w:id="13" w:name="veri-temizleme-ve-kalite-kontrolü"/>
+    <w:p>
+      <w:pPr>
+        <w:pStyle w:val="Heading3"/>
+      </w:pPr>
+      <w:r>
+        <w:t xml:space="preserve">4.2 Veri Temizleme ve Kalite Kontrolü</w:t>
+      </w:r>
+    </w:p>
+    <w:p>
+      <w:pPr>
+        <w:pStyle w:val="FirstParagraph"/>
+      </w:pPr>
+      <w:r>
+        <w:t xml:space="preserve">Veri tabanında yer alan kayıp değerler taranmış ve geçerli gözlemler ayrıştırılmıştır.</w:t>
+      </w:r>
+      <w:r>
+        <w:t xml:space="preserve"> </w:t>
+      </w:r>
+      <w:r>
+        <w:t xml:space="preserve">Üç standart sapma (±3 SD) sınırını aşan uç değerler ve dağılım çarpıklıkları belirlenmiştir.</w:t>
+      </w:r>
+    </w:p>
+    <w:bookmarkEnd w:id="13"/>
+    <w:bookmarkStart w:id="14" w:name="analiz-değişkenlerinin-oluşturulması"/>
+    <w:p>
+      <w:pPr>
+        <w:pStyle w:val="Heading3"/>
+      </w:pPr>
+      <w:r>
+        <w:t xml:space="preserve">4.3 Analiz Değişkenlerinin Oluşturulması</w:t>
+      </w:r>
+    </w:p>
+    <w:p>
+      <w:pPr>
+        <w:pStyle w:val="FirstParagraph"/>
+      </w:pPr>
+      <w:r>
+        <w:t xml:space="preserve">Analiz edilecek sürekli değişkenler (5 adet) ile kategorik değişkenler (2 adet) sınıflandırılarak analiz matrisi hazır hale getirilmiştir.</w:t>
+      </w:r>
+    </w:p>
+    <w:bookmarkEnd w:id="14"/>
+    <w:bookmarkStart w:id="15" w:name="analize-hazırlık-ve-yöntem-seçimi"/>
+    <w:p>
+      <w:pPr>
+        <w:pStyle w:val="Heading3"/>
+      </w:pPr>
+      <w:r>
+        <w:t xml:space="preserve">4.4 Analize Hazırlık ve Yöntem Seçimi</w:t>
+      </w:r>
+    </w:p>
+    <w:p>
+      <w:pPr>
+        <w:pStyle w:val="FirstParagraph"/>
+      </w:pPr>
+      <w:r>
+        <w:t xml:space="preserve">Veri setindeki normallik testleri (Shapiro-Wilk / basıklık-çarpıklık oranları) ve varyans homojenliği (Levene) testleri otomatik olarak tamamlanmış, her analiz için en uygun parametrik veya parametrik olmayan yöntem seçilmiştir.</w:t>
+      </w:r>
+    </w:p>
+    <w:p>
+      <w:r>
+        <w:br w:type="page"/>
+      </w:r>
+    </w:p>
+    <w:bookmarkEnd w:id="15"/>
+    <w:bookmarkEnd w:id="16"/>
+    <w:bookmarkStart w:id="29" w:name="X4ae346c3dc7002860ba141f0a49c2c2659a807d"/>
+    <w:p>
+      <w:pPr>
+        <w:pStyle w:val="Heading1"/>
+      </w:pPr>
+      <w:r>
+        <w:t xml:space="preserve">5. Betimsel İstatistikler — Sürekli Değişkenler</w:t>
+      </w:r>
+    </w:p>
+    <w:p>
+      <w:pPr>
+        <w:pStyle w:val="FirstParagraph"/>
+      </w:pPr>
+      <w:r>
+        <w:t xml:space="preserve">Yaş değişkeni için ortalama 41,76 (SS = 13,79, n = 300) olarak hesaplanmıştır. İş Tatmini değişkeni için ortalama 2,69 (SS = 0,91, n = 300) olarak hesaplanmıştır. Tükenmişlik değişkeni için ortalama 2,78 (SS = 0,91, n = 285) olarak hesaplanmıştır. Özyeterlik değişkeni için ortalama 3,96 (SS = 0,66, n = 300) olarak hesaplanmıştır.</w:t>
+      </w:r>
+    </w:p>
+    <w:p>
+      <w:pPr>
+        <w:pStyle w:val="TableCaption"/>
+      </w:pPr>
+      <w:r>
+        <w:t xml:space="preserve">Tablo 2. Sürekli Değişkenler İçin Betimsel İstatistikler</w:t>
+      </w:r>
+    </w:p>
+    <w:tbl>
+      <w:tblPr>
+        <w:tblStyle w:val="Table"/>
+        <w:tblW w:type="auto" w:w="0"/>
+        <w:tblLook w:firstRow="1" w:lastRow="0" w:firstColumn="0" w:lastColumn="0" w:noHBand="0" w:noVBand="0" w:val="0020"/>
+        <w:tblCaption w:val="Tablo 2. Sürekli Değişkenler İçin Betimsel İstatistikler"/>
       </w:tblPr>
       <w:tblGrid>
         <w:gridCol w:w="1320"/>
@@ -680,18 +1751,18 @@
           <wp:inline>
             <wp:extent cx="5334000" cy="3296393"/>
             <wp:effectExtent b="0" l="0" r="0" t="0"/>
-            <wp:docPr descr="Şekil 1. Yaş Değişkeninin Dağılımı" title="" id="10" name="Picture"/>
+            <wp:docPr descr="Şekil 1. Yaş Değişkeninin Dağılımı" title="" id="18" name="Picture"/>
             <a:graphic>
               <a:graphicData uri="http://schemas.openxmlformats.org/drawingml/2006/picture">
                 <pic:pic>
                   <pic:nvPicPr>
-                    <pic:cNvPr descr="/tmp/statrep_output/figures/fig-desc-Yaş.png" id="11" name="Picture"/>
+                    <pic:cNvPr descr="examples\sample-report\figures\fig-desc-Yaş.png" id="19" name="Picture"/>
                     <pic:cNvPicPr>
                       <a:picLocks noChangeArrowheads="1" noChangeAspect="1"/>
                     </pic:cNvPicPr>
                   </pic:nvPicPr>
                   <pic:blipFill>
-                    <a:blip r:embed="rId9"/>
+                    <a:blip r:embed="rId17"/>
                     <a:stretch>
                       <a:fillRect/>
                     </a:stretch>
@@ -735,18 +1806,18 @@
           <wp:inline>
             <wp:extent cx="5334000" cy="3296393"/>
             <wp:effectExtent b="0" l="0" r="0" t="0"/>
-            <wp:docPr descr="Şekil 2. İş Tatmini Değişkeninin Dağılımı" title="" id="13" name="Picture"/>
+            <wp:docPr descr="Şekil 2. İş Tatmini Değişkeninin Dağılımı" title="" id="21" name="Picture"/>
             <a:graphic>
               <a:graphicData uri="http://schemas.openxmlformats.org/drawingml/2006/picture">
                 <pic:pic>
                   <pic:nvPicPr>
-                    <pic:cNvPr descr="/tmp/statrep_output/figures/fig-desc-İş%20Tatmini.png" id="14" name="Picture"/>
+                    <pic:cNvPr descr="examples\sample-report\figures\fig-desc-İş%20Tatmini.png" id="22" name="Picture"/>
                     <pic:cNvPicPr>
                       <a:picLocks noChangeArrowheads="1" noChangeAspect="1"/>
                     </pic:cNvPicPr>
                   </pic:nvPicPr>
                   <pic:blipFill>
-                    <a:blip r:embed="rId12"/>
+                    <a:blip r:embed="rId20"/>
                     <a:stretch>
                       <a:fillRect/>
                     </a:stretch>
@@ -790,18 +1861,18 @@
           <wp:inline>
             <wp:extent cx="5334000" cy="3296393"/>
             <wp:effectExtent b="0" l="0" r="0" t="0"/>
-            <wp:docPr descr="Şekil 3. Tükenmişlik Değişkeninin Dağılımı" title="" id="16" name="Picture"/>
+            <wp:docPr descr="Şekil 3. Tükenmişlik Değişkeninin Dağılımı" title="" id="24" name="Picture"/>
             <a:graphic>
               <a:graphicData uri="http://schemas.openxmlformats.org/drawingml/2006/picture">
                 <pic:pic>
                   <pic:nvPicPr>
-                    <pic:cNvPr descr="/tmp/statrep_output/figures/fig-desc-Tükenmişlik.png" id="17" name="Picture"/>
+                    <pic:cNvPr descr="examples\sample-report\figures\fig-desc-Tükenmişlik.png" id="25" name="Picture"/>
                     <pic:cNvPicPr>
                       <a:picLocks noChangeArrowheads="1" noChangeAspect="1"/>
                     </pic:cNvPicPr>
                   </pic:nvPicPr>
                   <pic:blipFill>
-                    <a:blip r:embed="rId15"/>
+                    <a:blip r:embed="rId23"/>
                     <a:stretch>
                       <a:fillRect/>
                     </a:stretch>
@@ -845,18 +1916,18 @@
           <wp:inline>
             <wp:extent cx="5334000" cy="3296393"/>
             <wp:effectExtent b="0" l="0" r="0" t="0"/>
-            <wp:docPr descr="Şekil 4. Özyeterlik Değişkeninin Dağılımı" title="" id="19" name="Picture"/>
+            <wp:docPr descr="Şekil 4. Özyeterlik Değişkeninin Dağılımı" title="" id="27" name="Picture"/>
             <a:graphic>
               <a:graphicData uri="http://schemas.openxmlformats.org/drawingml/2006/picture">
                 <pic:pic>
                   <pic:nvPicPr>
-                    <pic:cNvPr descr="/tmp/statrep_output/figures/fig-desc-Özyeterlik.png" id="20" name="Picture"/>
+                    <pic:cNvPr descr="examples\sample-report\figures\fig-desc-Özyeterlik.png" id="28" name="Picture"/>
                     <pic:cNvPicPr>
                       <a:picLocks noChangeArrowheads="1" noChangeAspect="1"/>
                     </pic:cNvPicPr>
                   </pic:nvPicPr>
                   <pic:blipFill>
-                    <a:blip r:embed="rId18"/>
+                    <a:blip r:embed="rId26"/>
                     <a:stretch>
                       <a:fillRect/>
                     </a:stretch>
@@ -911,14 +1982,19 @@
         <w:t xml:space="preserve">: 3 value(s) beyond 3 SD from the mean.</w:t>
       </w:r>
     </w:p>
-    <w:bookmarkEnd w:id="21"/>
-    <w:bookmarkStart w:id="25" w:name="korelasyon-analizi"/>
+    <w:p>
+      <w:r>
+        <w:br w:type="page"/>
+      </w:r>
+    </w:p>
+    <w:bookmarkEnd w:id="29"/>
+    <w:bookmarkStart w:id="33" w:name="korelasyon-analizi"/>
     <w:p>
       <w:pPr>
         <w:pStyle w:val="Heading1"/>
       </w:pPr>
       <w:r>
-        <w:t xml:space="preserve">Korelasyon Analizi</w:t>
+        <w:t xml:space="preserve">6. Korelasyon Analizi</w:t>
       </w:r>
     </w:p>
     <w:p>
@@ -934,7 +2010,7 @@
         <w:pStyle w:val="TableCaption"/>
       </w:pPr>
       <w:r>
-        <w:t xml:space="preserve">Tablo 2. Korelasyon Matrisi</w:t>
+        <w:t xml:space="preserve">Tablo 3. Korelasyon Matrisi</w:t>
       </w:r>
     </w:p>
     <w:tbl>
@@ -942,7 +2018,7 @@
         <w:tblStyle w:val="Table"/>
         <w:tblW w:type="auto" w:w="0"/>
         <w:tblLook w:firstRow="1" w:lastRow="0" w:firstColumn="0" w:lastColumn="0" w:noHBand="0" w:noVBand="0" w:val="0020"/>
-        <w:tblCaption w:val="Tablo 2. Korelasyon Matrisi"/>
+        <w:tblCaption w:val="Tablo 3. Korelasyon Matrisi"/>
       </w:tblPr>
       <w:tblGrid>
         <w:gridCol w:w="1980"/>
@@ -1357,20 +2433,20 @@
       <w:r>
         <w:drawing>
           <wp:inline>
-            <wp:extent cx="5334000" cy="4770504"/>
+            <wp:extent cx="5334000" cy="4788861"/>
             <wp:effectExtent b="0" l="0" r="0" t="0"/>
-            <wp:docPr descr="Şekil 5. Korelasyon Isı Haritası" title="" id="23" name="Picture"/>
+            <wp:docPr descr="Şekil 5. Korelasyon Isı Haritası" title="" id="31" name="Picture"/>
             <a:graphic>
               <a:graphicData uri="http://schemas.openxmlformats.org/drawingml/2006/picture">
                 <pic:pic>
                   <pic:nvPicPr>
-                    <pic:cNvPr descr="/tmp/statrep_output/figures/fig-correlation-heatmap.png" id="24" name="Picture"/>
+                    <pic:cNvPr descr="examples\sample-report\figures\fig-correlation-heatmap.png" id="32" name="Picture"/>
                     <pic:cNvPicPr>
                       <a:picLocks noChangeArrowheads="1" noChangeAspect="1"/>
                     </pic:cNvPicPr>
                   </pic:nvPicPr>
                   <pic:blipFill>
-                    <a:blip r:embed="rId22"/>
+                    <a:blip r:embed="rId30"/>
                     <a:stretch>
                       <a:fillRect/>
                     </a:stretch>
@@ -1378,7 +2454,7 @@
                   <pic:spPr bwMode="auto">
                     <a:xfrm>
                       <a:off x="0" y="0"/>
-                      <a:ext cx="5334000" cy="4770504"/>
+                      <a:ext cx="5334000" cy="4788861"/>
                     </a:xfrm>
                     <a:prstGeom prst="rect">
                       <a:avLst/>
@@ -1405,14 +2481,19 @@
         <w:t xml:space="preserve">Şekil 5. Korelasyon Isı Haritası</w:t>
       </w:r>
     </w:p>
-    <w:bookmarkEnd w:id="25"/>
-    <w:bookmarkStart w:id="29" w:name="grup-karşılaştırmaları"/>
+    <w:p>
+      <w:r>
+        <w:br w:type="page"/>
+      </w:r>
+    </w:p>
+    <w:bookmarkEnd w:id="33"/>
+    <w:bookmarkStart w:id="37" w:name="grup-karşılaştırmaları"/>
     <w:p>
       <w:pPr>
         <w:pStyle w:val="Heading1"/>
       </w:pPr>
       <w:r>
-        <w:t xml:space="preserve">Grup Karşılaştırmaları</w:t>
+        <w:t xml:space="preserve">7. Grup Karşılaştırmaları</w:t>
       </w:r>
     </w:p>
     <w:p>
@@ -1428,7 +2509,7 @@
         <w:pStyle w:val="TableCaption"/>
       </w:pPr>
       <w:r>
-        <w:t xml:space="preserve">Tablo 3. Yaş Değişkeninin Cinsiyet Değişkenine Göre Karşılaştırması</w:t>
+        <w:t xml:space="preserve">Tablo 4. Yaş Değişkeninin Cinsiyet Değişkenine Göre Karşılaştırması</w:t>
       </w:r>
     </w:p>
     <w:tbl>
@@ -1436,7 +2517,7 @@
         <w:tblStyle w:val="Table"/>
         <w:tblW w:type="auto" w:w="0"/>
         <w:tblLook w:firstRow="1" w:lastRow="0" w:firstColumn="0" w:lastColumn="0" w:noHBand="0" w:noVBand="0" w:val="0020"/>
-        <w:tblCaption w:val="Tablo 3. Yaş Değişkeninin Cinsiyet Değişkenine Göre Karşılaştırması"/>
+        <w:tblCaption w:val="Tablo 4. Yaş Değişkeninin Cinsiyet Değişkenine Göre Karşılaştırması"/>
       </w:tblPr>
       <w:tblGrid>
         <w:gridCol w:w="1980"/>
@@ -1688,18 +2769,18 @@
           <wp:inline>
             <wp:extent cx="5334000" cy="3168641"/>
             <wp:effectExtent b="0" l="0" r="0" t="0"/>
-            <wp:docPr descr="Şekil 6. Yaş Değişkeninin Cinsiyet Değişkenine Göre Karşılaştırması" title="" id="27" name="Picture"/>
+            <wp:docPr descr="Şekil 6. Yaş Değişkeninin Cinsiyet Değişkenine Göre Karşılaştırması" title="" id="35" name="Picture"/>
             <a:graphic>
               <a:graphicData uri="http://schemas.openxmlformats.org/drawingml/2006/picture">
                 <pic:pic>
                   <pic:nvPicPr>
-                    <pic:cNvPr descr="/tmp/statrep_output/figures/fig-comparison-Yaş.png" id="28" name="Picture"/>
+                    <pic:cNvPr descr="examples\sample-report\figures\fig-comparison-Yaş.png" id="36" name="Picture"/>
                     <pic:cNvPicPr>
                       <a:picLocks noChangeArrowheads="1" noChangeAspect="1"/>
                     </pic:cNvPicPr>
                   </pic:nvPicPr>
                   <pic:blipFill>
-                    <a:blip r:embed="rId26"/>
+                    <a:blip r:embed="rId34"/>
                     <a:stretch>
                       <a:fillRect/>
                     </a:stretch>
@@ -1734,14 +2815,19 @@
         <w:t xml:space="preserve">Şekil 6. Yaş Değişkeninin Cinsiyet Değişkenine Göre Karşılaştırması</w:t>
       </w:r>
     </w:p>
-    <w:bookmarkEnd w:id="29"/>
-    <w:bookmarkStart w:id="33" w:name="regresyon-analizi"/>
+    <w:p>
+      <w:r>
+        <w:br w:type="page"/>
+      </w:r>
+    </w:p>
+    <w:bookmarkEnd w:id="37"/>
+    <w:bookmarkStart w:id="41" w:name="regresyon-analizi"/>
     <w:p>
       <w:pPr>
         <w:pStyle w:val="Heading1"/>
       </w:pPr>
       <w:r>
-        <w:t xml:space="preserve">Regresyon Analizi</w:t>
+        <w:t xml:space="preserve">8. Regresyon Analizi</w:t>
       </w:r>
     </w:p>
     <w:p>
@@ -1757,7 +2843,7 @@
         <w:pStyle w:val="TableCaption"/>
       </w:pPr>
       <w:r>
-        <w:t xml:space="preserve">Tablo 4. Özyeterlik Değişkenini Yordayan Regresyon Sonuçları</w:t>
+        <w:t xml:space="preserve">Tablo 5. Özyeterlik Değişkenini Yordayan Regresyon Sonuçları</w:t>
       </w:r>
     </w:p>
     <w:tbl>
@@ -1765,7 +2851,7 @@
         <w:tblStyle w:val="Table"/>
         <w:tblW w:type="auto" w:w="0"/>
         <w:tblLook w:firstRow="1" w:lastRow="0" w:firstColumn="0" w:lastColumn="0" w:noHBand="0" w:noVBand="0" w:val="0020"/>
-        <w:tblCaption w:val="Tablo 4. Özyeterlik Değişkenini Yordayan Regresyon Sonuçları"/>
+        <w:tblCaption w:val="Tablo 5. Özyeterlik Değişkenini Yordayan Regresyon Sonuçları"/>
       </w:tblPr>
       <w:tblGrid>
         <w:gridCol w:w="1131"/>
@@ -2488,18 +3574,18 @@
           <wp:inline>
             <wp:extent cx="5334000" cy="3975595"/>
             <wp:effectExtent b="0" l="0" r="0" t="0"/>
-            <wp:docPr descr="Şekil 7. Standartlaştırılmış Regresyon Katsayıları" title="" id="31" name="Picture"/>
+            <wp:docPr descr="Şekil 7. Standartlaştırılmış Regresyon Katsayıları" title="" id="39" name="Picture"/>
             <a:graphic>
               <a:graphicData uri="http://schemas.openxmlformats.org/drawingml/2006/picture">
                 <pic:pic>
                   <pic:nvPicPr>
-                    <pic:cNvPr descr="/tmp/statrep_output/figures/fig-regression-Özyeterlik.png" id="32" name="Picture"/>
+                    <pic:cNvPr descr="examples\sample-report\figures\fig-regression-Özyeterlik.png" id="40" name="Picture"/>
                     <pic:cNvPicPr>
                       <a:picLocks noChangeArrowheads="1" noChangeAspect="1"/>
                     </pic:cNvPicPr>
                   </pic:nvPicPr>
                   <pic:blipFill>
-                    <a:blip r:embed="rId30"/>
+                    <a:blip r:embed="rId38"/>
                     <a:stretch>
                       <a:fillRect/>
                     </a:stretch>
@@ -2534,7 +3620,1088 @@
         <w:t xml:space="preserve">Şekil 7. Standartlaştırılmış Regresyon Katsayıları</w:t>
       </w:r>
     </w:p>
-    <w:bookmarkEnd w:id="33"/>
+    <w:p>
+      <w:r>
+        <w:br w:type="page"/>
+      </w:r>
+    </w:p>
+    <w:bookmarkEnd w:id="41"/>
+    <w:bookmarkStart w:id="45" w:name="sonuç-ve-öneriler"/>
+    <w:p>
+      <w:pPr>
+        <w:pStyle w:val="Heading1"/>
+      </w:pPr>
+      <w:r>
+        <w:t xml:space="preserve">9. Sonuç ve Öneriler</w:t>
+      </w:r>
+    </w:p>
+    <w:bookmarkStart w:id="42" w:name="genel-bulgular"/>
+    <w:p>
+      <w:pPr>
+        <w:pStyle w:val="Heading3"/>
+      </w:pPr>
+      <w:r>
+        <w:t xml:space="preserve">Genel Bulgular</w:t>
+      </w:r>
+    </w:p>
+    <w:p>
+      <w:pPr>
+        <w:pStyle w:val="FirstParagraph"/>
+      </w:pPr>
+      <w:r>
+        <w:t xml:space="preserve">Analiz edilen 300 satırlık veri setinde, temel değişkenlerin dağılım ve merkezi eğilim parametreleri başarıyla çıkarılmıştır.</w:t>
+      </w:r>
+    </w:p>
+    <w:bookmarkEnd w:id="42"/>
+    <w:bookmarkStart w:id="43" w:name="grup-ve-ilişki-sonuçları"/>
+    <w:p>
+      <w:pPr>
+        <w:pStyle w:val="Heading3"/>
+      </w:pPr>
+      <w:r>
+        <w:t xml:space="preserve">Grup ve İlişki Sonuçları</w:t>
+      </w:r>
+    </w:p>
+    <w:p>
+      <w:pPr>
+        <w:pStyle w:val="FirstParagraph"/>
+      </w:pPr>
+      <w:r>
+        <w:t xml:space="preserve">Değişkenler arası korelasyon analizleri ve gruplar arası karşılaştırmalar anlamlı eğilimleri ortaya koymuştur. Ölçülen etki büyüklükleri ve anlamlılık düzeyleri ilgili analiz bölümlerinde detaylandırılmıştır.</w:t>
+      </w:r>
+    </w:p>
+    <w:bookmarkEnd w:id="43"/>
+    <w:bookmarkStart w:id="44" w:name="operasyonel-ve-stratejik-öneriler"/>
+    <w:p>
+      <w:pPr>
+        <w:pStyle w:val="Heading3"/>
+      </w:pPr>
+      <w:r>
+        <w:t xml:space="preserve">Operasyonel ve Stratejik Öneriler</w:t>
+      </w:r>
+    </w:p>
+    <w:p>
+      <w:pPr>
+        <w:pStyle w:val="Compact"/>
+        <w:numPr>
+          <w:ilvl w:val="0"/>
+          <w:numId w:val="1002"/>
+        </w:numPr>
+      </w:pPr>
+      <w:r>
+        <w:rPr>
+          <w:b/>
+          <w:bCs/>
+        </w:rPr>
+        <w:t xml:space="preserve">Süreç Optimizasyonu:</w:t>
+      </w:r>
+      <w:r>
+        <w:t xml:space="preserve"> </w:t>
+      </w:r>
+      <w:r>
+        <w:t xml:space="preserve">Yüksek varyasyon gösteren değişkenler için hedef odaklı operasyonel takip planları oluşturulmalıdır.</w:t>
+      </w:r>
+    </w:p>
+    <w:p>
+      <w:pPr>
+        <w:pStyle w:val="Compact"/>
+        <w:numPr>
+          <w:ilvl w:val="0"/>
+          <w:numId w:val="1002"/>
+        </w:numPr>
+      </w:pPr>
+      <w:r>
+        <w:rPr>
+          <w:b/>
+          <w:bCs/>
+        </w:rPr>
+        <w:t xml:space="preserve">Kapasite ve Kaynak Yönetimi:</w:t>
+      </w:r>
+      <w:r>
+        <w:t xml:space="preserve"> </w:t>
+      </w:r>
+      <w:r>
+        <w:t xml:space="preserve">Grup farklılıklarının belirginleştiği segmentlerde kaynak tahsisi dinamik olarak revize edilmelidir.</w:t>
+      </w:r>
+    </w:p>
+    <w:p>
+      <w:pPr>
+        <w:pStyle w:val="Compact"/>
+        <w:numPr>
+          <w:ilvl w:val="0"/>
+          <w:numId w:val="1002"/>
+        </w:numPr>
+      </w:pPr>
+      <w:r>
+        <w:rPr>
+          <w:b/>
+          <w:bCs/>
+        </w:rPr>
+        <w:t xml:space="preserve">Periyodik İzleme:</w:t>
+      </w:r>
+      <w:r>
+        <w:t xml:space="preserve"> </w:t>
+      </w:r>
+      <w:r>
+        <w:t xml:space="preserve">Veri kalitesi ve değişken ilişkileri düzenli çeyreklik dönemlerle izlenmeli ve karar süreçlerine entegre edilmelidir.</w:t>
+      </w:r>
+    </w:p>
+    <w:p>
+      <w:r>
+        <w:br w:type="page"/>
+      </w:r>
+    </w:p>
+    <w:bookmarkEnd w:id="44"/>
+    <w:bookmarkEnd w:id="45"/>
+    <w:bookmarkStart w:id="46" w:name="ekler"/>
+    <w:p>
+      <w:pPr>
+        <w:pStyle w:val="Heading1"/>
+      </w:pPr>
+      <w:r>
+        <w:t xml:space="preserve">10. Ekler</w:t>
+      </w:r>
+    </w:p>
+    <w:p>
+      <w:pPr>
+        <w:pStyle w:val="TableCaption"/>
+      </w:pPr>
+      <w:r>
+        <w:t xml:space="preserve">Tablo 6. Analiz Değişkenleri Dağılım ve Özet Listesi</w:t>
+      </w:r>
+    </w:p>
+    <w:tbl>
+      <w:tblPr>
+        <w:tblStyle w:val="Table"/>
+        <w:tblW w:type="auto" w:w="0"/>
+        <w:tblLook w:firstRow="1" w:lastRow="0" w:firstColumn="0" w:lastColumn="0" w:noHBand="0" w:noVBand="0" w:val="0020"/>
+        <w:tblCaption w:val="Tablo 6. Analiz Değişkenleri Dağılım ve Özet Listesi"/>
+      </w:tblPr>
+      <w:tblGrid>
+        <w:gridCol w:w="1320"/>
+        <w:gridCol w:w="1320"/>
+        <w:gridCol w:w="1320"/>
+        <w:gridCol w:w="1320"/>
+        <w:gridCol w:w="1320"/>
+        <w:gridCol w:w="1320"/>
+      </w:tblGrid>
+      <w:tr>
+        <w:trPr>
+          <w:tblHeader w:val="on"/>
+        </w:trPr>
+        <w:tc>
+          <w:tcPr>
+            <w:tcBorders>
+              <w:top w:sz="6" w:val="single" w:color="000000"/>
+              <w:left w:sz="0" w:val="nil" w:color="auto"/>
+              <w:bottom w:sz="6" w:val="single" w:color="000000"/>
+              <w:right w:sz="0" w:val="nil" w:color="auto"/>
+            </w:tcBorders>
+          </w:tcPr>
+          <w:p>
+            <w:pPr>
+              <w:pStyle w:val="Compact"/>
+            </w:pPr>
+            <w:r>
+              <w:t xml:space="preserve">Değişken</w:t>
+            </w:r>
+          </w:p>
+        </w:tc>
+        <w:tc>
+          <w:tcPr>
+            <w:tcBorders>
+              <w:top w:sz="6" w:val="single" w:color="000000"/>
+              <w:left w:sz="0" w:val="nil" w:color="auto"/>
+              <w:bottom w:sz="6" w:val="single" w:color="000000"/>
+              <w:right w:sz="0" w:val="nil" w:color="auto"/>
+            </w:tcBorders>
+          </w:tcPr>
+          <w:p>
+            <w:pPr>
+              <w:pStyle w:val="Compact"/>
+            </w:pPr>
+            <w:r>
+              <w:t xml:space="preserve">Veri Türü</w:t>
+            </w:r>
+          </w:p>
+        </w:tc>
+        <w:tc>
+          <w:tcPr>
+            <w:tcBorders>
+              <w:top w:sz="6" w:val="single" w:color="000000"/>
+              <w:left w:sz="0" w:val="nil" w:color="auto"/>
+              <w:bottom w:sz="6" w:val="single" w:color="000000"/>
+              <w:right w:sz="0" w:val="nil" w:color="auto"/>
+            </w:tcBorders>
+          </w:tcPr>
+          <w:p>
+            <w:pPr>
+              <w:pStyle w:val="Compact"/>
+              <w:jc w:val="right"/>
+            </w:pPr>
+            <w:r>
+              <w:t xml:space="preserve">Min</w:t>
+            </w:r>
+          </w:p>
+        </w:tc>
+        <w:tc>
+          <w:tcPr>
+            <w:tcBorders>
+              <w:top w:sz="6" w:val="single" w:color="000000"/>
+              <w:left w:sz="0" w:val="nil" w:color="auto"/>
+              <w:bottom w:sz="6" w:val="single" w:color="000000"/>
+              <w:right w:sz="0" w:val="nil" w:color="auto"/>
+            </w:tcBorders>
+          </w:tcPr>
+          <w:p>
+            <w:pPr>
+              <w:pStyle w:val="Compact"/>
+              <w:jc w:val="right"/>
+            </w:pPr>
+            <w:r>
+              <w:t xml:space="preserve">Maks</w:t>
+            </w:r>
+          </w:p>
+        </w:tc>
+        <w:tc>
+          <w:tcPr>
+            <w:tcBorders>
+              <w:top w:sz="6" w:val="single" w:color="000000"/>
+              <w:left w:sz="0" w:val="nil" w:color="auto"/>
+              <w:bottom w:sz="6" w:val="single" w:color="000000"/>
+              <w:right w:sz="0" w:val="nil" w:color="auto"/>
+            </w:tcBorders>
+          </w:tcPr>
+          <w:p>
+            <w:pPr>
+              <w:pStyle w:val="Compact"/>
+              <w:jc w:val="right"/>
+            </w:pPr>
+            <w:r>
+              <w:t xml:space="preserve">M</w:t>
+            </w:r>
+          </w:p>
+        </w:tc>
+        <w:tc>
+          <w:tcPr>
+            <w:tcBorders>
+              <w:top w:sz="6" w:val="single" w:color="000000"/>
+              <w:left w:sz="0" w:val="nil" w:color="auto"/>
+              <w:bottom w:sz="6" w:val="single" w:color="000000"/>
+              <w:right w:sz="0" w:val="nil" w:color="auto"/>
+            </w:tcBorders>
+          </w:tcPr>
+          <w:p>
+            <w:pPr>
+              <w:pStyle w:val="Compact"/>
+              <w:jc w:val="right"/>
+            </w:pPr>
+            <w:r>
+              <w:t xml:space="preserve">SD</w:t>
+            </w:r>
+          </w:p>
+        </w:tc>
+      </w:tr>
+      <w:tr>
+        <w:tc>
+          <w:tcPr>
+            <w:tcBorders>
+              <w:top w:sz="0" w:val="nil" w:color="auto"/>
+              <w:left w:sz="0" w:val="nil" w:color="auto"/>
+              <w:bottom w:sz="0" w:val="nil" w:color="auto"/>
+              <w:right w:sz="0" w:val="nil" w:color="auto"/>
+            </w:tcBorders>
+          </w:tcPr>
+          <w:p>
+            <w:pPr>
+              <w:pStyle w:val="Compact"/>
+            </w:pPr>
+            <w:r>
+              <w:t xml:space="preserve">Katılımcı No</w:t>
+            </w:r>
+          </w:p>
+        </w:tc>
+        <w:tc>
+          <w:tcPr>
+            <w:tcBorders>
+              <w:top w:sz="0" w:val="nil" w:color="auto"/>
+              <w:left w:sz="0" w:val="nil" w:color="auto"/>
+              <w:bottom w:sz="0" w:val="nil" w:color="auto"/>
+              <w:right w:sz="0" w:val="nil" w:color="auto"/>
+            </w:tcBorders>
+          </w:tcPr>
+          <w:p>
+            <w:pPr>
+              <w:pStyle w:val="Compact"/>
+            </w:pPr>
+            <w:r>
+              <w:t xml:space="preserve">Sürekli (Sayısal)</w:t>
+            </w:r>
+          </w:p>
+        </w:tc>
+        <w:tc>
+          <w:tcPr>
+            <w:tcBorders>
+              <w:top w:sz="0" w:val="nil" w:color="auto"/>
+              <w:left w:sz="0" w:val="nil" w:color="auto"/>
+              <w:bottom w:sz="0" w:val="nil" w:color="auto"/>
+              <w:right w:sz="0" w:val="nil" w:color="auto"/>
+            </w:tcBorders>
+          </w:tcPr>
+          <w:p>
+            <w:pPr>
+              <w:pStyle w:val="Compact"/>
+              <w:jc w:val="right"/>
+            </w:pPr>
+            <w:r>
+              <w:t xml:space="preserve">1,00</w:t>
+            </w:r>
+          </w:p>
+        </w:tc>
+        <w:tc>
+          <w:tcPr>
+            <w:tcBorders>
+              <w:top w:sz="0" w:val="nil" w:color="auto"/>
+              <w:left w:sz="0" w:val="nil" w:color="auto"/>
+              <w:bottom w:sz="0" w:val="nil" w:color="auto"/>
+              <w:right w:sz="0" w:val="nil" w:color="auto"/>
+            </w:tcBorders>
+          </w:tcPr>
+          <w:p>
+            <w:pPr>
+              <w:pStyle w:val="Compact"/>
+              <w:jc w:val="right"/>
+            </w:pPr>
+            <w:r>
+              <w:t xml:space="preserve">300,00</w:t>
+            </w:r>
+          </w:p>
+        </w:tc>
+        <w:tc>
+          <w:tcPr>
+            <w:tcBorders>
+              <w:top w:sz="0" w:val="nil" w:color="auto"/>
+              <w:left w:sz="0" w:val="nil" w:color="auto"/>
+              <w:bottom w:sz="0" w:val="nil" w:color="auto"/>
+              <w:right w:sz="0" w:val="nil" w:color="auto"/>
+            </w:tcBorders>
+          </w:tcPr>
+          <w:p>
+            <w:pPr>
+              <w:pStyle w:val="Compact"/>
+              <w:jc w:val="right"/>
+            </w:pPr>
+            <w:r>
+              <w:t xml:space="preserve">150,50</w:t>
+            </w:r>
+          </w:p>
+        </w:tc>
+        <w:tc>
+          <w:tcPr>
+            <w:tcBorders>
+              <w:top w:sz="0" w:val="nil" w:color="auto"/>
+              <w:left w:sz="0" w:val="nil" w:color="auto"/>
+              <w:bottom w:sz="0" w:val="nil" w:color="auto"/>
+              <w:right w:sz="0" w:val="nil" w:color="auto"/>
+            </w:tcBorders>
+          </w:tcPr>
+          <w:p>
+            <w:pPr>
+              <w:pStyle w:val="Compact"/>
+              <w:jc w:val="right"/>
+            </w:pPr>
+            <w:r>
+              <w:t xml:space="preserve">86,75</w:t>
+            </w:r>
+          </w:p>
+        </w:tc>
+      </w:tr>
+      <w:tr>
+        <w:tc>
+          <w:tcPr>
+            <w:tcBorders>
+              <w:top w:sz="0" w:val="nil" w:color="auto"/>
+              <w:left w:sz="0" w:val="nil" w:color="auto"/>
+              <w:bottom w:sz="0" w:val="nil" w:color="auto"/>
+              <w:right w:sz="0" w:val="nil" w:color="auto"/>
+            </w:tcBorders>
+          </w:tcPr>
+          <w:p>
+            <w:pPr>
+              <w:pStyle w:val="Compact"/>
+            </w:pPr>
+            <w:r>
+              <w:t xml:space="preserve">Yaş</w:t>
+            </w:r>
+          </w:p>
+        </w:tc>
+        <w:tc>
+          <w:tcPr>
+            <w:tcBorders>
+              <w:top w:sz="0" w:val="nil" w:color="auto"/>
+              <w:left w:sz="0" w:val="nil" w:color="auto"/>
+              <w:bottom w:sz="0" w:val="nil" w:color="auto"/>
+              <w:right w:sz="0" w:val="nil" w:color="auto"/>
+            </w:tcBorders>
+          </w:tcPr>
+          <w:p>
+            <w:pPr>
+              <w:pStyle w:val="Compact"/>
+            </w:pPr>
+            <w:r>
+              <w:t xml:space="preserve">Sürekli (Sayısal)</w:t>
+            </w:r>
+          </w:p>
+        </w:tc>
+        <w:tc>
+          <w:tcPr>
+            <w:tcBorders>
+              <w:top w:sz="0" w:val="nil" w:color="auto"/>
+              <w:left w:sz="0" w:val="nil" w:color="auto"/>
+              <w:bottom w:sz="0" w:val="nil" w:color="auto"/>
+              <w:right w:sz="0" w:val="nil" w:color="auto"/>
+            </w:tcBorders>
+          </w:tcPr>
+          <w:p>
+            <w:pPr>
+              <w:pStyle w:val="Compact"/>
+              <w:jc w:val="right"/>
+            </w:pPr>
+            <w:r>
+              <w:t xml:space="preserve">18,00</w:t>
+            </w:r>
+          </w:p>
+        </w:tc>
+        <w:tc>
+          <w:tcPr>
+            <w:tcBorders>
+              <w:top w:sz="0" w:val="nil" w:color="auto"/>
+              <w:left w:sz="0" w:val="nil" w:color="auto"/>
+              <w:bottom w:sz="0" w:val="nil" w:color="auto"/>
+              <w:right w:sz="0" w:val="nil" w:color="auto"/>
+            </w:tcBorders>
+          </w:tcPr>
+          <w:p>
+            <w:pPr>
+              <w:pStyle w:val="Compact"/>
+              <w:jc w:val="right"/>
+            </w:pPr>
+            <w:r>
+              <w:t xml:space="preserve">64,00</w:t>
+            </w:r>
+          </w:p>
+        </w:tc>
+        <w:tc>
+          <w:tcPr>
+            <w:tcBorders>
+              <w:top w:sz="0" w:val="nil" w:color="auto"/>
+              <w:left w:sz="0" w:val="nil" w:color="auto"/>
+              <w:bottom w:sz="0" w:val="nil" w:color="auto"/>
+              <w:right w:sz="0" w:val="nil" w:color="auto"/>
+            </w:tcBorders>
+          </w:tcPr>
+          <w:p>
+            <w:pPr>
+              <w:pStyle w:val="Compact"/>
+              <w:jc w:val="right"/>
+            </w:pPr>
+            <w:r>
+              <w:t xml:space="preserve">41,76</w:t>
+            </w:r>
+          </w:p>
+        </w:tc>
+        <w:tc>
+          <w:tcPr>
+            <w:tcBorders>
+              <w:top w:sz="0" w:val="nil" w:color="auto"/>
+              <w:left w:sz="0" w:val="nil" w:color="auto"/>
+              <w:bottom w:sz="0" w:val="nil" w:color="auto"/>
+              <w:right w:sz="0" w:val="nil" w:color="auto"/>
+            </w:tcBorders>
+          </w:tcPr>
+          <w:p>
+            <w:pPr>
+              <w:pStyle w:val="Compact"/>
+              <w:jc w:val="right"/>
+            </w:pPr>
+            <w:r>
+              <w:t xml:space="preserve">13,79</w:t>
+            </w:r>
+          </w:p>
+        </w:tc>
+      </w:tr>
+      <w:tr>
+        <w:tc>
+          <w:tcPr>
+            <w:tcBorders>
+              <w:top w:sz="0" w:val="nil" w:color="auto"/>
+              <w:left w:sz="0" w:val="nil" w:color="auto"/>
+              <w:bottom w:sz="0" w:val="nil" w:color="auto"/>
+              <w:right w:sz="0" w:val="nil" w:color="auto"/>
+            </w:tcBorders>
+          </w:tcPr>
+          <w:p>
+            <w:pPr>
+              <w:pStyle w:val="Compact"/>
+            </w:pPr>
+            <w:r>
+              <w:t xml:space="preserve">Cinsiyet</w:t>
+            </w:r>
+          </w:p>
+        </w:tc>
+        <w:tc>
+          <w:tcPr>
+            <w:tcBorders>
+              <w:top w:sz="0" w:val="nil" w:color="auto"/>
+              <w:left w:sz="0" w:val="nil" w:color="auto"/>
+              <w:bottom w:sz="0" w:val="nil" w:color="auto"/>
+              <w:right w:sz="0" w:val="nil" w:color="auto"/>
+            </w:tcBorders>
+          </w:tcPr>
+          <w:p>
+            <w:pPr>
+              <w:pStyle w:val="Compact"/>
+            </w:pPr>
+            <w:r>
+              <w:t xml:space="preserve">Kategorik</w:t>
+            </w:r>
+          </w:p>
+        </w:tc>
+        <w:tc>
+          <w:tcPr>
+            <w:tcBorders>
+              <w:top w:sz="0" w:val="nil" w:color="auto"/>
+              <w:left w:sz="0" w:val="nil" w:color="auto"/>
+              <w:bottom w:sz="0" w:val="nil" w:color="auto"/>
+              <w:right w:sz="0" w:val="nil" w:color="auto"/>
+            </w:tcBorders>
+          </w:tcPr>
+          <w:p>
+            <w:pPr>
+              <w:pStyle w:val="Compact"/>
+              <w:jc w:val="right"/>
+            </w:pPr>
+            <w:r>
+              <w:t xml:space="preserve">-</w:t>
+            </w:r>
+          </w:p>
+        </w:tc>
+        <w:tc>
+          <w:tcPr>
+            <w:tcBorders>
+              <w:top w:sz="0" w:val="nil" w:color="auto"/>
+              <w:left w:sz="0" w:val="nil" w:color="auto"/>
+              <w:bottom w:sz="0" w:val="nil" w:color="auto"/>
+              <w:right w:sz="0" w:val="nil" w:color="auto"/>
+            </w:tcBorders>
+          </w:tcPr>
+          <w:p>
+            <w:pPr>
+              <w:pStyle w:val="Compact"/>
+              <w:jc w:val="right"/>
+            </w:pPr>
+            <w:r>
+              <w:t xml:space="preserve">-</w:t>
+            </w:r>
+          </w:p>
+        </w:tc>
+        <w:tc>
+          <w:tcPr>
+            <w:tcBorders>
+              <w:top w:sz="0" w:val="nil" w:color="auto"/>
+              <w:left w:sz="0" w:val="nil" w:color="auto"/>
+              <w:bottom w:sz="0" w:val="nil" w:color="auto"/>
+              <w:right w:sz="0" w:val="nil" w:color="auto"/>
+            </w:tcBorders>
+          </w:tcPr>
+          <w:p>
+            <w:pPr>
+              <w:pStyle w:val="Compact"/>
+              <w:jc w:val="right"/>
+            </w:pPr>
+            <w:r>
+              <w:t xml:space="preserve">-</w:t>
+            </w:r>
+          </w:p>
+        </w:tc>
+        <w:tc>
+          <w:tcPr>
+            <w:tcBorders>
+              <w:top w:sz="0" w:val="nil" w:color="auto"/>
+              <w:left w:sz="0" w:val="nil" w:color="auto"/>
+              <w:bottom w:sz="0" w:val="nil" w:color="auto"/>
+              <w:right w:sz="0" w:val="nil" w:color="auto"/>
+            </w:tcBorders>
+          </w:tcPr>
+          <w:p>
+            <w:pPr>
+              <w:pStyle w:val="Compact"/>
+              <w:jc w:val="right"/>
+            </w:pPr>
+            <w:r>
+              <w:t xml:space="preserve">-</w:t>
+            </w:r>
+          </w:p>
+        </w:tc>
+      </w:tr>
+      <w:tr>
+        <w:tc>
+          <w:tcPr>
+            <w:tcBorders>
+              <w:top w:sz="0" w:val="nil" w:color="auto"/>
+              <w:left w:sz="0" w:val="nil" w:color="auto"/>
+              <w:bottom w:sz="0" w:val="nil" w:color="auto"/>
+              <w:right w:sz="0" w:val="nil" w:color="auto"/>
+            </w:tcBorders>
+          </w:tcPr>
+          <w:p>
+            <w:pPr>
+              <w:pStyle w:val="Compact"/>
+            </w:pPr>
+            <w:r>
+              <w:t xml:space="preserve">Eğitim Düzeyi</w:t>
+            </w:r>
+          </w:p>
+        </w:tc>
+        <w:tc>
+          <w:tcPr>
+            <w:tcBorders>
+              <w:top w:sz="0" w:val="nil" w:color="auto"/>
+              <w:left w:sz="0" w:val="nil" w:color="auto"/>
+              <w:bottom w:sz="0" w:val="nil" w:color="auto"/>
+              <w:right w:sz="0" w:val="nil" w:color="auto"/>
+            </w:tcBorders>
+          </w:tcPr>
+          <w:p>
+            <w:pPr>
+              <w:pStyle w:val="Compact"/>
+            </w:pPr>
+            <w:r>
+              <w:t xml:space="preserve">Kategorik</w:t>
+            </w:r>
+          </w:p>
+        </w:tc>
+        <w:tc>
+          <w:tcPr>
+            <w:tcBorders>
+              <w:top w:sz="0" w:val="nil" w:color="auto"/>
+              <w:left w:sz="0" w:val="nil" w:color="auto"/>
+              <w:bottom w:sz="0" w:val="nil" w:color="auto"/>
+              <w:right w:sz="0" w:val="nil" w:color="auto"/>
+            </w:tcBorders>
+          </w:tcPr>
+          <w:p>
+            <w:pPr>
+              <w:pStyle w:val="Compact"/>
+              <w:jc w:val="right"/>
+            </w:pPr>
+            <w:r>
+              <w:t xml:space="preserve">-</w:t>
+            </w:r>
+          </w:p>
+        </w:tc>
+        <w:tc>
+          <w:tcPr>
+            <w:tcBorders>
+              <w:top w:sz="0" w:val="nil" w:color="auto"/>
+              <w:left w:sz="0" w:val="nil" w:color="auto"/>
+              <w:bottom w:sz="0" w:val="nil" w:color="auto"/>
+              <w:right w:sz="0" w:val="nil" w:color="auto"/>
+            </w:tcBorders>
+          </w:tcPr>
+          <w:p>
+            <w:pPr>
+              <w:pStyle w:val="Compact"/>
+              <w:jc w:val="right"/>
+            </w:pPr>
+            <w:r>
+              <w:t xml:space="preserve">-</w:t>
+            </w:r>
+          </w:p>
+        </w:tc>
+        <w:tc>
+          <w:tcPr>
+            <w:tcBorders>
+              <w:top w:sz="0" w:val="nil" w:color="auto"/>
+              <w:left w:sz="0" w:val="nil" w:color="auto"/>
+              <w:bottom w:sz="0" w:val="nil" w:color="auto"/>
+              <w:right w:sz="0" w:val="nil" w:color="auto"/>
+            </w:tcBorders>
+          </w:tcPr>
+          <w:p>
+            <w:pPr>
+              <w:pStyle w:val="Compact"/>
+              <w:jc w:val="right"/>
+            </w:pPr>
+            <w:r>
+              <w:t xml:space="preserve">-</w:t>
+            </w:r>
+          </w:p>
+        </w:tc>
+        <w:tc>
+          <w:tcPr>
+            <w:tcBorders>
+              <w:top w:sz="0" w:val="nil" w:color="auto"/>
+              <w:left w:sz="0" w:val="nil" w:color="auto"/>
+              <w:bottom w:sz="0" w:val="nil" w:color="auto"/>
+              <w:right w:sz="0" w:val="nil" w:color="auto"/>
+            </w:tcBorders>
+          </w:tcPr>
+          <w:p>
+            <w:pPr>
+              <w:pStyle w:val="Compact"/>
+              <w:jc w:val="right"/>
+            </w:pPr>
+            <w:r>
+              <w:t xml:space="preserve">-</w:t>
+            </w:r>
+          </w:p>
+        </w:tc>
+      </w:tr>
+      <w:tr>
+        <w:tc>
+          <w:tcPr>
+            <w:tcBorders>
+              <w:top w:sz="0" w:val="nil" w:color="auto"/>
+              <w:left w:sz="0" w:val="nil" w:color="auto"/>
+              <w:bottom w:sz="0" w:val="nil" w:color="auto"/>
+              <w:right w:sz="0" w:val="nil" w:color="auto"/>
+            </w:tcBorders>
+          </w:tcPr>
+          <w:p>
+            <w:pPr>
+              <w:pStyle w:val="Compact"/>
+            </w:pPr>
+            <w:r>
+              <w:t xml:space="preserve">İş Tatmini</w:t>
+            </w:r>
+          </w:p>
+        </w:tc>
+        <w:tc>
+          <w:tcPr>
+            <w:tcBorders>
+              <w:top w:sz="0" w:val="nil" w:color="auto"/>
+              <w:left w:sz="0" w:val="nil" w:color="auto"/>
+              <w:bottom w:sz="0" w:val="nil" w:color="auto"/>
+              <w:right w:sz="0" w:val="nil" w:color="auto"/>
+            </w:tcBorders>
+          </w:tcPr>
+          <w:p>
+            <w:pPr>
+              <w:pStyle w:val="Compact"/>
+            </w:pPr>
+            <w:r>
+              <w:t xml:space="preserve">Sürekli (Sayısal)</w:t>
+            </w:r>
+          </w:p>
+        </w:tc>
+        <w:tc>
+          <w:tcPr>
+            <w:tcBorders>
+              <w:top w:sz="0" w:val="nil" w:color="auto"/>
+              <w:left w:sz="0" w:val="nil" w:color="auto"/>
+              <w:bottom w:sz="0" w:val="nil" w:color="auto"/>
+              <w:right w:sz="0" w:val="nil" w:color="auto"/>
+            </w:tcBorders>
+          </w:tcPr>
+          <w:p>
+            <w:pPr>
+              <w:pStyle w:val="Compact"/>
+              <w:jc w:val="right"/>
+            </w:pPr>
+            <w:r>
+              <w:t xml:space="preserve">1,00</w:t>
+            </w:r>
+          </w:p>
+        </w:tc>
+        <w:tc>
+          <w:tcPr>
+            <w:tcBorders>
+              <w:top w:sz="0" w:val="nil" w:color="auto"/>
+              <w:left w:sz="0" w:val="nil" w:color="auto"/>
+              <w:bottom w:sz="0" w:val="nil" w:color="auto"/>
+              <w:right w:sz="0" w:val="nil" w:color="auto"/>
+            </w:tcBorders>
+          </w:tcPr>
+          <w:p>
+            <w:pPr>
+              <w:pStyle w:val="Compact"/>
+              <w:jc w:val="right"/>
+            </w:pPr>
+            <w:r>
+              <w:t xml:space="preserve">4,80</w:t>
+            </w:r>
+          </w:p>
+        </w:tc>
+        <w:tc>
+          <w:tcPr>
+            <w:tcBorders>
+              <w:top w:sz="0" w:val="nil" w:color="auto"/>
+              <w:left w:sz="0" w:val="nil" w:color="auto"/>
+              <w:bottom w:sz="0" w:val="nil" w:color="auto"/>
+              <w:right w:sz="0" w:val="nil" w:color="auto"/>
+            </w:tcBorders>
+          </w:tcPr>
+          <w:p>
+            <w:pPr>
+              <w:pStyle w:val="Compact"/>
+              <w:jc w:val="right"/>
+            </w:pPr>
+            <w:r>
+              <w:t xml:space="preserve">2,69</w:t>
+            </w:r>
+          </w:p>
+        </w:tc>
+        <w:tc>
+          <w:tcPr>
+            <w:tcBorders>
+              <w:top w:sz="0" w:val="nil" w:color="auto"/>
+              <w:left w:sz="0" w:val="nil" w:color="auto"/>
+              <w:bottom w:sz="0" w:val="nil" w:color="auto"/>
+              <w:right w:sz="0" w:val="nil" w:color="auto"/>
+            </w:tcBorders>
+          </w:tcPr>
+          <w:p>
+            <w:pPr>
+              <w:pStyle w:val="Compact"/>
+              <w:jc w:val="right"/>
+            </w:pPr>
+            <w:r>
+              <w:t xml:space="preserve">0,91</w:t>
+            </w:r>
+          </w:p>
+        </w:tc>
+      </w:tr>
+      <w:tr>
+        <w:tc>
+          <w:tcPr>
+            <w:tcBorders>
+              <w:top w:sz="0" w:val="nil" w:color="auto"/>
+              <w:left w:sz="0" w:val="nil" w:color="auto"/>
+              <w:bottom w:sz="0" w:val="nil" w:color="auto"/>
+              <w:right w:sz="0" w:val="nil" w:color="auto"/>
+            </w:tcBorders>
+          </w:tcPr>
+          <w:p>
+            <w:pPr>
+              <w:pStyle w:val="Compact"/>
+            </w:pPr>
+            <w:r>
+              <w:t xml:space="preserve">Tükenmişlik</w:t>
+            </w:r>
+          </w:p>
+        </w:tc>
+        <w:tc>
+          <w:tcPr>
+            <w:tcBorders>
+              <w:top w:sz="0" w:val="nil" w:color="auto"/>
+              <w:left w:sz="0" w:val="nil" w:color="auto"/>
+              <w:bottom w:sz="0" w:val="nil" w:color="auto"/>
+              <w:right w:sz="0" w:val="nil" w:color="auto"/>
+            </w:tcBorders>
+          </w:tcPr>
+          <w:p>
+            <w:pPr>
+              <w:pStyle w:val="Compact"/>
+            </w:pPr>
+            <w:r>
+              <w:t xml:space="preserve">Sürekli (Sayısal)</w:t>
+            </w:r>
+          </w:p>
+        </w:tc>
+        <w:tc>
+          <w:tcPr>
+            <w:tcBorders>
+              <w:top w:sz="0" w:val="nil" w:color="auto"/>
+              <w:left w:sz="0" w:val="nil" w:color="auto"/>
+              <w:bottom w:sz="0" w:val="nil" w:color="auto"/>
+              <w:right w:sz="0" w:val="nil" w:color="auto"/>
+            </w:tcBorders>
+          </w:tcPr>
+          <w:p>
+            <w:pPr>
+              <w:pStyle w:val="Compact"/>
+              <w:jc w:val="right"/>
+            </w:pPr>
+            <w:r>
+              <w:t xml:space="preserve">1,00</w:t>
+            </w:r>
+          </w:p>
+        </w:tc>
+        <w:tc>
+          <w:tcPr>
+            <w:tcBorders>
+              <w:top w:sz="0" w:val="nil" w:color="auto"/>
+              <w:left w:sz="0" w:val="nil" w:color="auto"/>
+              <w:bottom w:sz="0" w:val="nil" w:color="auto"/>
+              <w:right w:sz="0" w:val="nil" w:color="auto"/>
+            </w:tcBorders>
+          </w:tcPr>
+          <w:p>
+            <w:pPr>
+              <w:pStyle w:val="Compact"/>
+              <w:jc w:val="right"/>
+            </w:pPr>
+            <w:r>
+              <w:t xml:space="preserve">5,00</w:t>
+            </w:r>
+          </w:p>
+        </w:tc>
+        <w:tc>
+          <w:tcPr>
+            <w:tcBorders>
+              <w:top w:sz="0" w:val="nil" w:color="auto"/>
+              <w:left w:sz="0" w:val="nil" w:color="auto"/>
+              <w:bottom w:sz="0" w:val="nil" w:color="auto"/>
+              <w:right w:sz="0" w:val="nil" w:color="auto"/>
+            </w:tcBorders>
+          </w:tcPr>
+          <w:p>
+            <w:pPr>
+              <w:pStyle w:val="Compact"/>
+              <w:jc w:val="right"/>
+            </w:pPr>
+            <w:r>
+              <w:t xml:space="preserve">2,78</w:t>
+            </w:r>
+          </w:p>
+        </w:tc>
+        <w:tc>
+          <w:tcPr>
+            <w:tcBorders>
+              <w:top w:sz="0" w:val="nil" w:color="auto"/>
+              <w:left w:sz="0" w:val="nil" w:color="auto"/>
+              <w:bottom w:sz="0" w:val="nil" w:color="auto"/>
+              <w:right w:sz="0" w:val="nil" w:color="auto"/>
+            </w:tcBorders>
+          </w:tcPr>
+          <w:p>
+            <w:pPr>
+              <w:pStyle w:val="Compact"/>
+              <w:jc w:val="right"/>
+            </w:pPr>
+            <w:r>
+              <w:t xml:space="preserve">0,91</w:t>
+            </w:r>
+          </w:p>
+        </w:tc>
+      </w:tr>
+      <w:tr>
+        <w:tc>
+          <w:tcPr>
+            <w:tcBorders>
+              <w:top w:sz="0" w:val="nil" w:color="auto"/>
+              <w:left w:sz="0" w:val="nil" w:color="auto"/>
+              <w:bottom w:sz="6" w:val="single" w:color="000000"/>
+              <w:right w:sz="0" w:val="nil" w:color="auto"/>
+            </w:tcBorders>
+          </w:tcPr>
+          <w:p>
+            <w:pPr>
+              <w:pStyle w:val="Compact"/>
+            </w:pPr>
+            <w:r>
+              <w:t xml:space="preserve">Özyeterlik</w:t>
+            </w:r>
+          </w:p>
+        </w:tc>
+        <w:tc>
+          <w:tcPr>
+            <w:tcBorders>
+              <w:top w:sz="0" w:val="nil" w:color="auto"/>
+              <w:left w:sz="0" w:val="nil" w:color="auto"/>
+              <w:bottom w:sz="6" w:val="single" w:color="000000"/>
+              <w:right w:sz="0" w:val="nil" w:color="auto"/>
+            </w:tcBorders>
+          </w:tcPr>
+          <w:p>
+            <w:pPr>
+              <w:pStyle w:val="Compact"/>
+            </w:pPr>
+            <w:r>
+              <w:t xml:space="preserve">Sürekli (Sayısal)</w:t>
+            </w:r>
+          </w:p>
+        </w:tc>
+        <w:tc>
+          <w:tcPr>
+            <w:tcBorders>
+              <w:top w:sz="0" w:val="nil" w:color="auto"/>
+              <w:left w:sz="0" w:val="nil" w:color="auto"/>
+              <w:bottom w:sz="6" w:val="single" w:color="000000"/>
+              <w:right w:sz="0" w:val="nil" w:color="auto"/>
+            </w:tcBorders>
+          </w:tcPr>
+          <w:p>
+            <w:pPr>
+              <w:pStyle w:val="Compact"/>
+              <w:jc w:val="right"/>
+            </w:pPr>
+            <w:r>
+              <w:t xml:space="preserve">1,60</w:t>
+            </w:r>
+          </w:p>
+        </w:tc>
+        <w:tc>
+          <w:tcPr>
+            <w:tcBorders>
+              <w:top w:sz="0" w:val="nil" w:color="auto"/>
+              <w:left w:sz="0" w:val="nil" w:color="auto"/>
+              <w:bottom w:sz="6" w:val="single" w:color="000000"/>
+              <w:right w:sz="0" w:val="nil" w:color="auto"/>
+            </w:tcBorders>
+          </w:tcPr>
+          <w:p>
+            <w:pPr>
+              <w:pStyle w:val="Compact"/>
+              <w:jc w:val="right"/>
+            </w:pPr>
+            <w:r>
+              <w:t xml:space="preserve">5,20</w:t>
+            </w:r>
+          </w:p>
+        </w:tc>
+        <w:tc>
+          <w:tcPr>
+            <w:tcBorders>
+              <w:top w:sz="0" w:val="nil" w:color="auto"/>
+              <w:left w:sz="0" w:val="nil" w:color="auto"/>
+              <w:bottom w:sz="6" w:val="single" w:color="000000"/>
+              <w:right w:sz="0" w:val="nil" w:color="auto"/>
+            </w:tcBorders>
+          </w:tcPr>
+          <w:p>
+            <w:pPr>
+              <w:pStyle w:val="Compact"/>
+              <w:jc w:val="right"/>
+            </w:pPr>
+            <w:r>
+              <w:t xml:space="preserve">3,96</w:t>
+            </w:r>
+          </w:p>
+        </w:tc>
+        <w:tc>
+          <w:tcPr>
+            <w:tcBorders>
+              <w:top w:sz="0" w:val="nil" w:color="auto"/>
+              <w:left w:sz="0" w:val="nil" w:color="auto"/>
+              <w:bottom w:sz="6" w:val="single" w:color="000000"/>
+              <w:right w:sz="0" w:val="nil" w:color="auto"/>
+            </w:tcBorders>
+          </w:tcPr>
+          <w:p>
+            <w:pPr>
+              <w:pStyle w:val="Compact"/>
+              <w:jc w:val="right"/>
+            </w:pPr>
+            <w:r>
+              <w:t xml:space="preserve">0,66</w:t>
+            </w:r>
+          </w:p>
+        </w:tc>
+      </w:tr>
+    </w:tbl>
+    <w:bookmarkEnd w:id="46"/>
     <w:sectPr>
       <w:footnotePr>
         <w:numRestart w:val="eachSect"/>
@@ -2646,8 +4813,117 @@
       </w:pPr>
     </w:lvl>
   </w:abstractNum>
+  <w:abstractNum w:abstractNumId="991">
+    <w:nsid w:val="0000A991"/>
+    <w:multiLevelType w:val="multilevel"/>
+    <w:lvl w:ilvl="0">
+      <w:numFmt w:val="bullet"/>
+      <w:lvlText w:val=""/>
+      <w:lvlJc w:val="left"/>
+      <w:pPr>
+        <w:ind w:left="720" w:hanging="360"/>
+      </w:pPr>
+      <w:rPr>
+        <w:rFonts w:ascii="Symbol" w:hAnsi="Symbol" w:cs="Symbol" w:hint="default"/>
+      </w:rPr>
+    </w:lvl>
+    <w:lvl w:ilvl="1">
+      <w:numFmt w:val="bullet"/>
+      <w:lvlText w:val="o"/>
+      <w:lvlJc w:val="left"/>
+      <w:pPr>
+        <w:ind w:left="1440" w:hanging="360"/>
+      </w:pPr>
+      <w:rPr>
+        <w:rFonts w:ascii="Courier New" w:hAnsi="Courier New" w:cs="Courier New" w:hint="default"/>
+      </w:rPr>
+    </w:lvl>
+    <w:lvl w:ilvl="2">
+      <w:numFmt w:val="bullet"/>
+      <w:lvlText w:val=""/>
+      <w:lvlJc w:val="left"/>
+      <w:pPr>
+        <w:ind w:left="2160" w:hanging="360"/>
+      </w:pPr>
+      <w:rPr>
+        <w:rFonts w:ascii="Wingdings" w:hAnsi="Wingdings" w:cs="Wingdings" w:hint="default"/>
+      </w:rPr>
+    </w:lvl>
+    <w:lvl w:ilvl="3">
+      <w:numFmt w:val="bullet"/>
+      <w:lvlText w:val=""/>
+      <w:lvlJc w:val="left"/>
+      <w:pPr>
+        <w:ind w:left="2880" w:hanging="360"/>
+      </w:pPr>
+      <w:rPr>
+        <w:rFonts w:ascii="Symbol" w:hAnsi="Symbol" w:cs="Symbol" w:hint="default"/>
+      </w:rPr>
+    </w:lvl>
+    <w:lvl w:ilvl="4">
+      <w:numFmt w:val="bullet"/>
+      <w:lvlText w:val="o"/>
+      <w:lvlJc w:val="left"/>
+      <w:pPr>
+        <w:ind w:left="3600" w:hanging="360"/>
+      </w:pPr>
+      <w:rPr>
+        <w:rFonts w:ascii="Courier New" w:hAnsi="Courier New" w:cs="Courier New" w:hint="default"/>
+      </w:rPr>
+    </w:lvl>
+    <w:lvl w:ilvl="5">
+      <w:numFmt w:val="bullet"/>
+      <w:lvlText w:val=""/>
+      <w:lvlJc w:val="left"/>
+      <w:pPr>
+        <w:ind w:left="4320" w:hanging="360"/>
+      </w:pPr>
+      <w:rPr>
+        <w:rFonts w:ascii="Wingdings" w:hAnsi="Wingdings" w:cs="Wingdings" w:hint="default"/>
+      </w:rPr>
+    </w:lvl>
+    <w:lvl w:ilvl="6">
+      <w:numFmt w:val="bullet"/>
+      <w:lvlText w:val=""/>
+      <w:lvlJc w:val="left"/>
+      <w:pPr>
+        <w:ind w:left="5040" w:hanging="360"/>
+      </w:pPr>
+      <w:rPr>
+        <w:rFonts w:ascii="Symbol" w:hAnsi="Symbol" w:cs="Symbol" w:hint="default"/>
+      </w:rPr>
+    </w:lvl>
+    <w:lvl w:ilvl="7">
+      <w:numFmt w:val="bullet"/>
+      <w:lvlText w:val="o"/>
+      <w:lvlJc w:val="left"/>
+      <w:pPr>
+        <w:ind w:left="5760" w:hanging="360"/>
+      </w:pPr>
+      <w:rPr>
+        <w:rFonts w:ascii="Courier New" w:hAnsi="Courier New" w:cs="Courier New" w:hint="default"/>
+      </w:rPr>
+    </w:lvl>
+    <w:lvl w:ilvl="8">
+      <w:numFmt w:val="bullet"/>
+      <w:lvlText w:val=""/>
+      <w:lvlJc w:val="left"/>
+      <w:pPr>
+        <w:ind w:left="6480" w:hanging="360"/>
+      </w:pPr>
+      <w:rPr>
+        <w:rFonts w:ascii="Wingdings" w:hAnsi="Wingdings" w:cs="Wingdings" w:hint="default"/>
+      </w:rPr>
+    </w:lvl>
+  </w:abstractNum>
   <w:num w:numId="1000">
     <w:abstractNumId w:val="990"/>
+  </w:num>
+  <w:num w:numId="1001">
+    <w:abstractNumId w:val="991"/>
+  </w:num>
+  <w:num w:numId="1002">
+    <w:abstractNumId w:val="991"/>
   </w:num>
 </w:numbering>
 </file>
@@ -2715,7 +4991,7 @@
     <w:qFormat/>
     <w:rsid w:val="00A10FD9"/>
     <w:pPr>
-      <w:spacing w:after="80" w:line="240" w:lineRule="auto"/>
+      <w:spacing w:after="360" w:before="1440" w:line="240" w:lineRule="auto"/>
       <w:contextualSpacing/>
       <w:jc w:val="center"/>
     </w:pPr>
@@ -2723,7 +4999,7 @@
       <w:rFonts w:ascii="Liberation Serif" w:asciiTheme="majorHAnsi" w:cs="Liberation Serif" w:cstheme="majorBidi" w:eastAsia="Liberation Serif" w:eastAsiaTheme="majorEastAsia" w:hAnsi="Liberation Serif" w:hAnsiTheme="majorHAnsi"/>
       <w:b/>
       <w:i w:val="0"/>
-      <w:sz w:val="32"/>
+      <w:sz w:val="36"/>
       <w:szCs w:val="56"/>
     </w:rPr>
   </w:style>
@@ -2751,11 +5027,15 @@
       <w:numPr>
         <w:ilvl w:val="1"/>
       </w:numPr>
+      <w:spacing w:after="480"/>
+      <w:jc w:val="center"/>
     </w:pPr>
     <w:rPr>
-      <w:rFonts w:cstheme="majorBidi" w:eastAsiaTheme="majorEastAsia"/>
+      <w:rFonts w:ascii="Liberation Serif" w:cs="Liberation Serif" w:cstheme="majorBidi" w:eastAsia="Liberation Serif" w:eastAsiaTheme="majorEastAsia" w:hAnsi="Liberation Serif"/>
+      <w:b w:val="0"/>
+      <w:i/>
       <w:spacing w:val="15"/>
-      <w:sz w:val="28"/>
+      <w:sz w:val="26"/>
       <w:szCs w:val="28"/>
     </w:rPr>
   </w:style>
@@ -2781,8 +5061,13 @@
     <w:pPr>
       <w:keepNext/>
       <w:keepLines/>
+      <w:spacing w:after="240"/>
+      <w:jc w:val="center"/>
     </w:pPr>
     <w:rPr>
+      <w:rFonts w:ascii="Liberation Serif" w:cs="Liberation Serif" w:eastAsia="Liberation Serif" w:hAnsi="Liberation Serif"/>
+      <w:b/>
+      <w:i w:val="0"/>
       <w:sz w:val="24"/>
       <w:szCs w:val="24"/>
     </w:rPr>
@@ -2795,9 +5080,14 @@
     <w:pPr>
       <w:keepNext/>
       <w:keepLines/>
+      <w:spacing w:after="720"/>
+      <w:jc w:val="center"/>
     </w:pPr>
     <w:rPr>
-      <w:sz w:val="24"/>
+      <w:rFonts w:ascii="Liberation Serif" w:cs="Liberation Serif" w:eastAsia="Liberation Serif" w:hAnsi="Liberation Serif"/>
+      <w:b w:val="0"/>
+      <w:i w:val="0"/>
+      <w:sz w:val="22"/>
       <w:szCs w:val="24"/>
     </w:rPr>
   </w:style>
@@ -2852,7 +5142,7 @@
     <w:pPr>
       <w:keepNext/>
       <w:keepLines/>
-      <w:spacing w:after="80" w:before="360"/>
+      <w:spacing w:after="240" w:before="360"/>
       <w:jc w:val="center"/>
       <w:outlineLvl w:val="0"/>
     </w:pPr>
@@ -2878,7 +5168,7 @@
     <w:pPr>
       <w:keepNext/>
       <w:keepLines/>
-      <w:spacing w:after="80" w:before="160"/>
+      <w:spacing w:after="120" w:before="240"/>
       <w:jc w:val="left"/>
       <w:outlineLvl w:val="1"/>
     </w:pPr>
@@ -2904,7 +5194,7 @@
     <w:pPr>
       <w:keepNext/>
       <w:keepLines/>
-      <w:spacing w:after="80" w:before="160"/>
+      <w:spacing w:after="120" w:before="240"/>
       <w:jc w:val="left"/>
       <w:outlineLvl w:val="2"/>
     </w:pPr>

</xml_diff>

<commit_message>
refactor: update default author to 'İsim Soyisim' / 'Firstname Lastname' and format date as DD/MM/YYYY
</commit_message>
<xml_diff>
--- a/examples/sample-report/report.docx
+++ b/examples/sample-report/report.docx
@@ -23,7 +23,7 @@
         <w:pStyle w:val="Author"/>
       </w:pPr>
       <w:r>
-        <w:t xml:space="preserve">Sılacan Soyer</w:t>
+        <w:t xml:space="preserve">İsim Soyisim</w:t>
       </w:r>
     </w:p>
     <w:p>
@@ -31,7 +31,7 @@
         <w:pStyle w:val="Date"/>
       </w:pPr>
       <w:r>
-        <w:t xml:space="preserve">2026-08-24</w:t>
+        <w:t xml:space="preserve">24/08/2026</w:t>
       </w:r>
     </w:p>
     <w:sdt>

</xml_diff>